<commit_message>
fix(orientacion): plantilla Word de remisión: loops de párrafo bien formados (cada entrada del recorrido y del motivo en su párrafo) y columna de fecha más ancha
</commit_message>
<xml_diff>
--- a/public/remision_template.docx
+++ b/public/remision_template.docx
@@ -363,16 +363,16 @@
       </w:tblPr>
       <w:tblGrid>
         <w:gridCol w:w="1701"/>
-        <w:gridCol w:w="3402"/>
+        <w:gridCol w:w="3061"/>
         <w:gridCol w:w="1701"/>
-        <w:gridCol w:w="1360"/>
-        <w:gridCol w:w="850"/>
-        <w:gridCol w:w="1190"/>
+        <w:gridCol w:w="1247"/>
+        <w:gridCol w:w="907"/>
+        <w:gridCol w:w="1587"/>
       </w:tblGrid>
       <w:tr>
         <w:tc>
           <w:tcPr>
-            <w:tcW w:type="dxa" w:w="5103"/>
+            <w:tcW w:type="dxa" w:w="4762"/>
             <w:gridSpan w:val="2"/>
             <w:tcMar>
               <w:top w:w="70" w:type="dxa"/>
@@ -422,7 +422,7 @@
         </w:tc>
         <w:tc>
           <w:tcPr>
-            <w:tcW w:type="dxa" w:w="5103"/>
+            <w:tcW w:type="dxa" w:w="5442"/>
             <w:gridSpan w:val="4"/>
             <w:tcMar>
               <w:top w:w="70" w:type="dxa"/>
@@ -474,7 +474,7 @@
       <w:tr>
         <w:tc>
           <w:tcPr>
-            <w:tcW w:type="dxa" w:w="5103"/>
+            <w:tcW w:type="dxa" w:w="4762"/>
             <w:gridSpan w:val="2"/>
             <w:tcMar>
               <w:top w:w="70" w:type="dxa"/>
@@ -617,7 +617,7 @@
         </w:tc>
         <w:tc>
           <w:tcPr>
-            <w:tcW w:type="dxa" w:w="3062"/>
+            <w:tcW w:type="dxa" w:w="2948"/>
             <w:gridSpan w:val="2"/>
             <w:tcMar>
               <w:top w:w="70" w:type="dxa"/>
@@ -667,7 +667,7 @@
         </w:tc>
         <w:tc>
           <w:tcPr>
-            <w:tcW w:type="dxa" w:w="2041"/>
+            <w:tcW w:type="dxa" w:w="2494"/>
             <w:gridSpan w:val="2"/>
             <w:tcMar>
               <w:top w:w="70" w:type="dxa"/>
@@ -719,7 +719,7 @@
       <w:tr>
         <w:tc>
           <w:tcPr>
-            <w:tcW w:type="dxa" w:w="5103"/>
+            <w:tcW w:type="dxa" w:w="4762"/>
             <w:gridSpan w:val="2"/>
             <w:tcMar>
               <w:top w:w="70" w:type="dxa"/>
@@ -769,7 +769,7 @@
         </w:tc>
         <w:tc>
           <w:tcPr>
-            <w:tcW w:type="dxa" w:w="3062"/>
+            <w:tcW w:type="dxa" w:w="2948"/>
             <w:gridSpan w:val="2"/>
             <w:tcMar>
               <w:top w:w="70" w:type="dxa"/>
@@ -819,7 +819,7 @@
         </w:tc>
         <w:tc>
           <w:tcPr>
-            <w:tcW w:type="dxa" w:w="2041"/>
+            <w:tcW w:type="dxa" w:w="2494"/>
             <w:gridSpan w:val="2"/>
             <w:tcMar>
               <w:top w:w="70" w:type="dxa"/>
@@ -1425,7 +1425,37 @@
                 <w:color w:val="12241A"/>
                 <w:sz w:val="21"/>
               </w:rPr>
-              <w:t>{#MOTIVO_P}{.}{/MOTIVO_P}</w:t>
+              <w:t>{#MOTIVO_P}</w:t>
+            </w:r>
+          </w:p>
+          <w:p>
+            <w:pPr>
+              <w:spacing w:line="276" w:lineRule="auto" w:after="100" w:before="0"/>
+            </w:pPr>
+            <w:r>
+              <w:rPr>
+                <w:rFonts w:ascii="Georgia" w:hAnsi="Georgia" w:cs="Georgia" w:eastAsia="Georgia"/>
+                <w:b w:val="0"/>
+                <w:i w:val="0"/>
+                <w:color w:val="12241A"/>
+                <w:sz w:val="21"/>
+              </w:rPr>
+              <w:t>{.}</w:t>
+            </w:r>
+          </w:p>
+          <w:p>
+            <w:pPr>
+              <w:spacing w:line="276" w:lineRule="auto" w:after="100" w:before="0"/>
+            </w:pPr>
+            <w:r>
+              <w:rPr>
+                <w:rFonts w:ascii="Georgia" w:hAnsi="Georgia" w:cs="Georgia" w:eastAsia="Georgia"/>
+                <w:b w:val="0"/>
+                <w:i w:val="0"/>
+                <w:color w:val="12241A"/>
+                <w:sz w:val="21"/>
+              </w:rPr>
+              <w:t>{/MOTIVO_P}</w:t>
             </w:r>
           </w:p>
         </w:tc>
@@ -1629,7 +1659,37 @@
                 <w:color w:val="12241A"/>
                 <w:sz w:val="21"/>
               </w:rPr>
-              <w:t>{#ESPECIFICACION_P}{.}{/ESPECIFICACION_P}</w:t>
+              <w:t>{#ESPECIFICACION_P}</w:t>
+            </w:r>
+          </w:p>
+          <w:p>
+            <w:pPr>
+              <w:spacing w:line="276" w:lineRule="auto" w:after="100" w:before="0"/>
+            </w:pPr>
+            <w:r>
+              <w:rPr>
+                <w:rFonts w:ascii="Georgia" w:hAnsi="Georgia" w:cs="Georgia" w:eastAsia="Georgia"/>
+                <w:b w:val="0"/>
+                <w:i w:val="0"/>
+                <w:color w:val="12241A"/>
+                <w:sz w:val="21"/>
+              </w:rPr>
+              <w:t>{.}</w:t>
+            </w:r>
+          </w:p>
+          <w:p>
+            <w:pPr>
+              <w:spacing w:line="276" w:lineRule="auto" w:after="100" w:before="0"/>
+            </w:pPr>
+            <w:r>
+              <w:rPr>
+                <w:rFonts w:ascii="Georgia" w:hAnsi="Georgia" w:cs="Georgia" w:eastAsia="Georgia"/>
+                <w:b w:val="0"/>
+                <w:i w:val="0"/>
+                <w:color w:val="12241A"/>
+                <w:sz w:val="21"/>
+              </w:rPr>
+              <w:t>{/ESPECIFICACION_P}</w:t>
             </w:r>
           </w:p>
         </w:tc>
@@ -1833,7 +1893,37 @@
                 <w:color w:val="12241A"/>
                 <w:sz w:val="21"/>
               </w:rPr>
-              <w:t>{#MEDIDAS_P}{.}{/MEDIDAS_P}</w:t>
+              <w:t>{#MEDIDAS_P}</w:t>
+            </w:r>
+          </w:p>
+          <w:p>
+            <w:pPr>
+              <w:spacing w:line="276" w:lineRule="auto" w:after="100" w:before="0"/>
+            </w:pPr>
+            <w:r>
+              <w:rPr>
+                <w:rFonts w:ascii="Georgia" w:hAnsi="Georgia" w:cs="Georgia" w:eastAsia="Georgia"/>
+                <w:b w:val="0"/>
+                <w:i w:val="0"/>
+                <w:color w:val="12241A"/>
+                <w:sz w:val="21"/>
+              </w:rPr>
+              <w:t>{.}</w:t>
+            </w:r>
+          </w:p>
+          <w:p>
+            <w:pPr>
+              <w:spacing w:line="276" w:lineRule="auto" w:after="100" w:before="0"/>
+            </w:pPr>
+            <w:r>
+              <w:rPr>
+                <w:rFonts w:ascii="Georgia" w:hAnsi="Georgia" w:cs="Georgia" w:eastAsia="Georgia"/>
+                <w:b w:val="0"/>
+                <w:i w:val="0"/>
+                <w:color w:val="12241A"/>
+                <w:sz w:val="21"/>
+              </w:rPr>
+              <w:t>{/MEDIDAS_P}</w:t>
             </w:r>
           </w:p>
         </w:tc>
@@ -2411,7 +2501,37 @@
                 <w:color w:val="12241A"/>
                 <w:sz w:val="19"/>
               </w:rPr>
-              <w:t>{#RECORRIDO_P}{.}{/RECORRIDO_P}</w:t>
+              <w:t>{#RECORRIDO_P}</w:t>
+            </w:r>
+          </w:p>
+          <w:p>
+            <w:pPr>
+              <w:spacing w:before="60" w:after="60" w:line="276" w:lineRule="auto"/>
+            </w:pPr>
+            <w:r>
+              <w:rPr>
+                <w:rFonts w:ascii="Georgia" w:hAnsi="Georgia" w:cs="Georgia" w:eastAsia="Georgia"/>
+                <w:b w:val="0"/>
+                <w:i w:val="0"/>
+                <w:color w:val="12241A"/>
+                <w:sz w:val="19"/>
+              </w:rPr>
+              <w:t>{.}</w:t>
+            </w:r>
+          </w:p>
+          <w:p>
+            <w:pPr>
+              <w:spacing w:before="60" w:after="60" w:line="276" w:lineRule="auto"/>
+            </w:pPr>
+            <w:r>
+              <w:rPr>
+                <w:rFonts w:ascii="Georgia" w:hAnsi="Georgia" w:cs="Georgia" w:eastAsia="Georgia"/>
+                <w:b w:val="0"/>
+                <w:i w:val="0"/>
+                <w:color w:val="12241A"/>
+                <w:sz w:val="19"/>
+              </w:rPr>
+              <w:t>{/RECORRIDO_P}</w:t>
             </w:r>
           </w:p>
         </w:tc>

</xml_diff>

<commit_message>
fix(orientacion): Word de remisión sin el renglón 'Recibido por · Fecha y hora' (quién atendió y cuándo ya van en la sección 6)
</commit_message>
<xml_diff>
--- a/public/remision_template.docx
+++ b/public/remision_template.docx
@@ -1952,8 +1952,7 @@
       </w:tblPr>
       <w:tblGrid>
         <w:gridCol w:w="4195"/>
-        <w:gridCol w:w="1814"/>
-        <w:gridCol w:w="4195"/>
+        <w:gridCol w:w="6010"/>
       </w:tblGrid>
       <w:tr>
         <w:tc>
@@ -2023,54 +2022,9 @@
         </w:tc>
         <w:tc>
           <w:tcPr>
-            <w:tcW w:type="dxa" w:w="1814"/>
+            <w:tcW w:type="dxa" w:w="6009"/>
           </w:tcPr>
           <w:p/>
-        </w:tc>
-        <w:tc>
-          <w:tcPr>
-            <w:tcW w:type="dxa" w:w="4195"/>
-            <w:vAlign w:val="bottom"/>
-            <w:tcMar>
-              <w:top w:w="0" w:type="dxa"/>
-              <w:bottom w:w="0" w:type="dxa"/>
-              <w:left w:w="0" w:type="dxa"/>
-              <w:right w:w="0" w:type="dxa"/>
-            </w:tcMar>
-          </w:tcPr>
-          <w:p>
-            <w:pPr>
-              <w:spacing w:before="0" w:after="0"/>
-              <w:jc w:val="center"/>
-              <w:pBdr>
-                <w:bottom w:val="single" w:sz="4" w:space="1" w:color="8A958E"/>
-              </w:pBdr>
-            </w:pPr>
-            <w:r>
-              <w:rPr>
-                <w:sz w:val="4"/>
-              </w:rPr>
-              <w:t xml:space="preserve"> </w:t>
-            </w:r>
-          </w:p>
-          <w:p>
-            <w:pPr>
-              <w:spacing w:before="60" w:after="0"/>
-              <w:jc w:val="center"/>
-            </w:pPr>
-            <w:r>
-              <w:rPr>
-                <w:rFonts w:ascii="Calibri" w:hAnsi="Calibri" w:cs="Calibri" w:eastAsia="Calibri"/>
-                <w:b w:val="0"/>
-                <w:i w:val="0"/>
-                <w:color w:val="6D7A72"/>
-                <w:sz w:val="13"/>
-                <w:spacing w:val="24"/>
-                <w:caps w:val="1"/>
-              </w:rPr>
-              <w:t>Recibido por  ·  Fecha y hora</w:t>
-            </w:r>
-          </w:p>
         </w:tc>
       </w:tr>
     </w:tbl>

</xml_diff>

<commit_message>
feat(orientacion): Word de remisión: sección 6 con una tarjeta por paso (título, quién y cuándo, motivo/especificación/medidas con etiqueta y firma de quien remitió) y por nota de seguimiento
</commit_message>
<xml_diff>
--- a/public/remision_template.docx
+++ b/public/remision_template.docx
@@ -2405,22 +2405,124 @@
           </w:p>
         </w:tc>
       </w:tr>
+    </w:tbl>
+    <w:p>
+      <w:pPr>
+        <w:spacing w:after="80"/>
+      </w:pPr>
+    </w:p>
+    <w:p>
+      <w:pPr>
+        <w:spacing w:after="0"/>
+      </w:pPr>
+      <w:r>
+        <w:rPr>
+          <w:rFonts w:ascii="Calibri" w:hAnsi="Calibri" w:cs="Calibri" w:eastAsia="Calibri"/>
+          <w:b w:val="0"/>
+          <w:i w:val="0"/>
+          <w:color w:val="FFFFFF"/>
+          <w:sz w:val="2"/>
+        </w:rPr>
+        <w:t>{#ENTRADAS}</w:t>
+      </w:r>
+    </w:p>
+    <w:tbl>
+      <w:tblPr>
+        <w:tblW w:type="dxa" w:w="10206"/>
+        <w:tblLayout w:type="fixed"/>
+        <w:tblLook w:firstColumn="1" w:firstRow="1" w:lastColumn="0" w:lastRow="0" w:noHBand="0" w:noVBand="1" w:val="04A0"/>
+        <w:tblLayout w:type="fixed"/>
+      </w:tblPr>
+      <w:tblGrid>
+        <w:gridCol w:w="4536"/>
+        <w:gridCol w:w="5670"/>
+      </w:tblGrid>
       <w:tr>
-        <w:trPr>
-          <w:trHeight w:val="907" w:hRule="atLeast"/>
-        </w:trPr>
         <w:tc>
           <w:tcPr>
-            <w:tcW w:type="dxa" w:w="10205"/>
-            <w:gridSpan w:val="4"/>
+            <w:tcW w:type="dxa" w:w="4535"/>
+            <w:shd w:val="clear" w:color="auto" w:fill="F2F5F3"/>
             <w:tcMar>
-              <w:top w:w="90" w:type="dxa"/>
-              <w:bottom w:w="120" w:type="dxa"/>
+              <w:top w:w="70" w:type="dxa"/>
+              <w:bottom w:w="70" w:type="dxa"/>
               <w:left w:w="120" w:type="dxa"/>
               <w:right w:w="120" w:type="dxa"/>
             </w:tcMar>
+            <w:vAlign w:val="center"/>
             <w:tcBorders>
               <w:top w:val="single" w:sz="4" w:space="0" w:color="B7C2BA"/>
+              <w:left w:val="single" w:sz="4" w:space="0" w:color="B7C2BA"/>
+              <w:bottom w:val="single" w:sz="4" w:space="0" w:color="B7C2BA"/>
+              <w:right w:val="nil"/>
+            </w:tcBorders>
+          </w:tcPr>
+          <w:p>
+            <w:pPr>
+              <w:spacing w:before="0" w:after="0"/>
+            </w:pPr>
+            <w:r>
+              <w:rPr>
+                <w:rFonts w:ascii="Calibri" w:hAnsi="Calibri" w:cs="Calibri" w:eastAsia="Calibri"/>
+                <w:b/>
+                <w:i w:val="0"/>
+                <w:color w:val="12241A"/>
+                <w:sz w:val="16"/>
+                <w:spacing w:val="24"/>
+                <w:caps w:val="1"/>
+              </w:rPr>
+              <w:t>{TITULO}</w:t>
+            </w:r>
+          </w:p>
+        </w:tc>
+        <w:tc>
+          <w:tcPr>
+            <w:tcW w:type="dxa" w:w="5669"/>
+            <w:shd w:val="clear" w:color="auto" w:fill="F2F5F3"/>
+            <w:tcMar>
+              <w:top w:w="70" w:type="dxa"/>
+              <w:bottom w:w="70" w:type="dxa"/>
+              <w:left w:w="120" w:type="dxa"/>
+              <w:right w:w="120" w:type="dxa"/>
+            </w:tcMar>
+            <w:vAlign w:val="center"/>
+            <w:tcBorders>
+              <w:top w:val="single" w:sz="4" w:space="0" w:color="B7C2BA"/>
+              <w:left w:val="nil"/>
+              <w:bottom w:val="single" w:sz="4" w:space="0" w:color="B7C2BA"/>
+              <w:right w:val="single" w:sz="4" w:space="0" w:color="B7C2BA"/>
+            </w:tcBorders>
+          </w:tcPr>
+          <w:p>
+            <w:pPr>
+              <w:spacing w:before="0" w:after="0"/>
+              <w:jc w:val="right"/>
+            </w:pPr>
+            <w:r>
+              <w:rPr>
+                <w:rFonts w:ascii="Calibri" w:hAnsi="Calibri" w:cs="Calibri" w:eastAsia="Calibri"/>
+                <w:b w:val="0"/>
+                <w:i w:val="0"/>
+                <w:color w:val="6D7A72"/>
+                <w:sz w:val="15"/>
+              </w:rPr>
+              <w:t>{META}</w:t>
+            </w:r>
+          </w:p>
+        </w:tc>
+      </w:tr>
+      <w:tr>
+        <w:tc>
+          <w:tcPr>
+            <w:tcW w:type="dxa" w:w="10204"/>
+            <w:gridSpan w:val="2"/>
+            <w:tcMar>
+              <w:top w:w="110" w:type="dxa"/>
+              <w:bottom w:w="120" w:type="dxa"/>
+              <w:left w:w="140" w:type="dxa"/>
+              <w:right w:w="140" w:type="dxa"/>
+            </w:tcMar>
+            <w:tcBorders>
+              <w:top w:val="nil"/>
               <w:left w:val="single" w:sz="4" w:space="0" w:color="B7C2BA"/>
               <w:bottom w:val="single" w:sz="4" w:space="0" w:color="B7C2BA"/>
               <w:right w:val="single" w:sz="4" w:space="0" w:color="B7C2BA"/>
@@ -2435,17 +2537,127 @@
                 <w:rFonts w:ascii="Calibri" w:hAnsi="Calibri" w:cs="Calibri" w:eastAsia="Calibri"/>
                 <w:b w:val="0"/>
                 <w:i w:val="0"/>
+                <w:color w:val="FFFFFF"/>
+                <w:sz w:val="2"/>
+              </w:rPr>
+              <w:t>{#esPaso}</w:t>
+            </w:r>
+          </w:p>
+          <w:p>
+            <w:pPr>
+              <w:spacing w:before="40" w:after="0"/>
+            </w:pPr>
+            <w:r>
+              <w:rPr>
+                <w:rFonts w:ascii="Calibri" w:hAnsi="Calibri" w:cs="Calibri" w:eastAsia="Calibri"/>
+                <w:b w:val="0"/>
+                <w:i w:val="0"/>
                 <w:color w:val="6D7A72"/>
                 <w:sz w:val="13"/>
                 <w:spacing w:val="24"/>
                 <w:caps w:val="1"/>
               </w:rPr>
-              <w:t>Observaciones del seguimiento</w:t>
+              <w:t>Motivo</w:t>
             </w:r>
           </w:p>
           <w:p>
             <w:pPr>
-              <w:spacing w:before="60" w:after="60" w:line="276" w:lineRule="auto"/>
+              <w:spacing w:before="20" w:after="100" w:line="276" w:lineRule="auto"/>
+            </w:pPr>
+            <w:r>
+              <w:rPr>
+                <w:rFonts w:ascii="Georgia" w:hAnsi="Georgia" w:cs="Georgia" w:eastAsia="Georgia"/>
+                <w:b w:val="0"/>
+                <w:i w:val="0"/>
+                <w:color w:val="12241A"/>
+                <w:sz w:val="20"/>
+              </w:rPr>
+              <w:t>{MOTIVO}</w:t>
+            </w:r>
+          </w:p>
+          <w:p>
+            <w:pPr>
+              <w:spacing w:before="40" w:after="0"/>
+            </w:pPr>
+            <w:r>
+              <w:rPr>
+                <w:rFonts w:ascii="Calibri" w:hAnsi="Calibri" w:cs="Calibri" w:eastAsia="Calibri"/>
+                <w:b w:val="0"/>
+                <w:i w:val="0"/>
+                <w:color w:val="6D7A72"/>
+                <w:sz w:val="13"/>
+                <w:spacing w:val="24"/>
+                <w:caps w:val="1"/>
+              </w:rPr>
+              <w:t>Especificación de la conducta</w:t>
+            </w:r>
+          </w:p>
+          <w:p>
+            <w:pPr>
+              <w:spacing w:before="20" w:after="100" w:line="276" w:lineRule="auto"/>
+            </w:pPr>
+            <w:r>
+              <w:rPr>
+                <w:rFonts w:ascii="Georgia" w:hAnsi="Georgia" w:cs="Georgia" w:eastAsia="Georgia"/>
+                <w:b w:val="0"/>
+                <w:i w:val="0"/>
+                <w:color w:val="12241A"/>
+                <w:sz w:val="20"/>
+              </w:rPr>
+              <w:t>{ESPECIFICACION}</w:t>
+            </w:r>
+          </w:p>
+          <w:p>
+            <w:pPr>
+              <w:spacing w:before="40" w:after="0"/>
+            </w:pPr>
+            <w:r>
+              <w:rPr>
+                <w:rFonts w:ascii="Calibri" w:hAnsi="Calibri" w:cs="Calibri" w:eastAsia="Calibri"/>
+                <w:b w:val="0"/>
+                <w:i w:val="0"/>
+                <w:color w:val="6D7A72"/>
+                <w:sz w:val="13"/>
+                <w:spacing w:val="24"/>
+                <w:caps w:val="1"/>
+              </w:rPr>
+              <w:t>Medidas pedagógicas aplicadas</w:t>
+            </w:r>
+          </w:p>
+          <w:p>
+            <w:pPr>
+              <w:spacing w:before="20" w:after="100" w:line="276" w:lineRule="auto"/>
+            </w:pPr>
+            <w:r>
+              <w:rPr>
+                <w:rFonts w:ascii="Georgia" w:hAnsi="Georgia" w:cs="Georgia" w:eastAsia="Georgia"/>
+                <w:b w:val="0"/>
+                <w:i w:val="0"/>
+                <w:color w:val="12241A"/>
+                <w:sz w:val="20"/>
+              </w:rPr>
+              <w:t>{MEDIDAS}</w:t>
+            </w:r>
+          </w:p>
+          <w:p>
+            <w:pPr>
+              <w:spacing w:before="80" w:after="0"/>
+              <w:jc w:val="left"/>
+            </w:pPr>
+            <w:r>
+              <w:rPr>
+                <w:rFonts w:ascii="Calibri" w:hAnsi="Calibri" w:cs="Calibri" w:eastAsia="Calibri"/>
+                <w:b w:val="0"/>
+                <w:i w:val="0"/>
+                <w:color w:val="6D7A72"/>
+                <w:sz w:val="12"/>
+              </w:rPr>
+              <w:t>{FIRMA_TAG}</w:t>
+            </w:r>
+          </w:p>
+          <w:p>
+            <w:pPr>
+              <w:spacing w:before="20" w:after="0"/>
             </w:pPr>
             <w:r>
               <w:rPr>
@@ -2455,12 +2667,54 @@
                 <w:color w:val="12241A"/>
                 <w:sz w:val="19"/>
               </w:rPr>
-              <w:t>{#RECORRIDO_P}</w:t>
+              <w:t>{QUIEN}</w:t>
+            </w:r>
+            <w:r>
+              <w:rPr>
+                <w:rFonts w:ascii="Calibri" w:hAnsi="Calibri" w:cs="Calibri" w:eastAsia="Calibri"/>
+                <w:b w:val="0"/>
+                <w:i w:val="0"/>
+                <w:color w:val="6D7A72"/>
+                <w:sz w:val="13"/>
+                <w:spacing w:val="18"/>
+                <w:caps w:val="1"/>
+              </w:rPr>
+              <w:t xml:space="preserve">   Firma de quien remite</w:t>
             </w:r>
           </w:p>
           <w:p>
             <w:pPr>
-              <w:spacing w:before="60" w:after="60" w:line="276" w:lineRule="auto"/>
+              <w:spacing w:before="0" w:after="0"/>
+            </w:pPr>
+            <w:r>
+              <w:rPr>
+                <w:rFonts w:ascii="Calibri" w:hAnsi="Calibri" w:cs="Calibri" w:eastAsia="Calibri"/>
+                <w:b w:val="0"/>
+                <w:i w:val="0"/>
+                <w:color w:val="FFFFFF"/>
+                <w:sz w:val="2"/>
+              </w:rPr>
+              <w:t>{/esPaso}</w:t>
+            </w:r>
+          </w:p>
+          <w:p>
+            <w:pPr>
+              <w:spacing w:before="0" w:after="0"/>
+            </w:pPr>
+            <w:r>
+              <w:rPr>
+                <w:rFonts w:ascii="Calibri" w:hAnsi="Calibri" w:cs="Calibri" w:eastAsia="Calibri"/>
+                <w:b w:val="0"/>
+                <w:i w:val="0"/>
+                <w:color w:val="FFFFFF"/>
+                <w:sz w:val="2"/>
+              </w:rPr>
+              <w:t>{#esNota}</w:t>
+            </w:r>
+          </w:p>
+          <w:p>
+            <w:pPr>
+              <w:spacing w:before="20" w:after="40" w:line="276" w:lineRule="auto"/>
             </w:pPr>
             <w:r>
               <w:rPr>
@@ -2468,29 +2722,64 @@
                 <w:b w:val="0"/>
                 <w:i w:val="0"/>
                 <w:color w:val="12241A"/>
-                <w:sz w:val="19"/>
+                <w:sz w:val="20"/>
               </w:rPr>
-              <w:t>{.}</w:t>
+              <w:t>{TEXTO}</w:t>
             </w:r>
           </w:p>
           <w:p>
             <w:pPr>
-              <w:spacing w:before="60" w:after="60" w:line="276" w:lineRule="auto"/>
+              <w:spacing w:before="0" w:after="0"/>
             </w:pPr>
             <w:r>
               <w:rPr>
-                <w:rFonts w:ascii="Georgia" w:hAnsi="Georgia" w:cs="Georgia" w:eastAsia="Georgia"/>
+                <w:rFonts w:ascii="Calibri" w:hAnsi="Calibri" w:cs="Calibri" w:eastAsia="Calibri"/>
                 <w:b w:val="0"/>
                 <w:i w:val="0"/>
-                <w:color w:val="12241A"/>
-                <w:sz w:val="19"/>
+                <w:color w:val="FFFFFF"/>
+                <w:sz w:val="2"/>
               </w:rPr>
-              <w:t>{/RECORRIDO_P}</w:t>
+              <w:t>{/esNota}</w:t>
             </w:r>
           </w:p>
         </w:tc>
       </w:tr>
     </w:tbl>
+    <w:p>
+      <w:pPr>
+        <w:spacing w:after="120"/>
+      </w:pPr>
+    </w:p>
+    <w:p>
+      <w:pPr>
+        <w:spacing w:after="0"/>
+      </w:pPr>
+      <w:r>
+        <w:rPr>
+          <w:rFonts w:ascii="Calibri" w:hAnsi="Calibri" w:cs="Calibri" w:eastAsia="Calibri"/>
+          <w:b w:val="0"/>
+          <w:i w:val="0"/>
+          <w:color w:val="FFFFFF"/>
+          <w:sz w:val="2"/>
+        </w:rPr>
+        <w:t>{/ENTRADAS}</w:t>
+      </w:r>
+    </w:p>
+    <w:p>
+      <w:pPr>
+        <w:spacing w:after="0"/>
+      </w:pPr>
+      <w:r>
+        <w:rPr>
+          <w:rFonts w:ascii="Georgia" w:hAnsi="Georgia" w:cs="Georgia" w:eastAsia="Georgia"/>
+          <w:b w:val="0"/>
+          <w:i w:val="0"/>
+          <w:color w:val="6D7A72"/>
+          <w:sz w:val="19"/>
+        </w:rPr>
+        <w:t>{#SIN_ENTRADAS}Sin pasos ni notas de seguimiento registrados.{/SIN_ENTRADAS}</w:t>
+      </w:r>
+    </w:p>
     <w:sectPr>
       <w:footerReference w:type="default" r:id="rId15"/>
       <w:pgSz w:w="12240" w:h="15840"/>

</xml_diff>

<commit_message>
fix(orientacion): Word de remisión: tarjetas del recorrido sin partirse entre páginas, más ancho para autor y fecha, autor de notas como 'Cargo Nombre'
</commit_message>
<xml_diff>
--- a/public/remision_template.docx
+++ b/public/remision_template.docx
@@ -2434,13 +2434,16 @@
         <w:tblLayout w:type="fixed"/>
       </w:tblPr>
       <w:tblGrid>
-        <w:gridCol w:w="4536"/>
-        <w:gridCol w:w="5670"/>
+        <w:gridCol w:w="3402"/>
+        <w:gridCol w:w="6804"/>
       </w:tblGrid>
       <w:tr>
+        <w:trPr>
+          <w:cantSplit/>
+        </w:trPr>
         <w:tc>
           <w:tcPr>
-            <w:tcW w:type="dxa" w:w="4535"/>
+            <w:tcW w:type="dxa" w:w="3402"/>
             <w:shd w:val="clear" w:color="auto" w:fill="F2F5F3"/>
             <w:tcMar>
               <w:top w:w="70" w:type="dxa"/>
@@ -2458,6 +2461,7 @@
           </w:tcPr>
           <w:p>
             <w:pPr>
+              <w:keepNext/>
               <w:spacing w:before="0" w:after="0"/>
             </w:pPr>
             <w:r>
@@ -2476,7 +2480,7 @@
         </w:tc>
         <w:tc>
           <w:tcPr>
-            <w:tcW w:type="dxa" w:w="5669"/>
+            <w:tcW w:type="dxa" w:w="6803"/>
             <w:shd w:val="clear" w:color="auto" w:fill="F2F5F3"/>
             <w:tcMar>
               <w:top w:w="70" w:type="dxa"/>
@@ -2494,6 +2498,7 @@
           </w:tcPr>
           <w:p>
             <w:pPr>
+              <w:keepNext/>
               <w:spacing w:before="0" w:after="0"/>
               <w:jc w:val="right"/>
             </w:pPr>
@@ -2511,9 +2516,12 @@
         </w:tc>
       </w:tr>
       <w:tr>
+        <w:trPr>
+          <w:cantSplit/>
+        </w:trPr>
         <w:tc>
           <w:tcPr>
-            <w:tcW w:type="dxa" w:w="10204"/>
+            <w:tcW w:type="dxa" w:w="10205"/>
             <w:gridSpan w:val="2"/>
             <w:tcMar>
               <w:top w:w="110" w:type="dxa"/>

</xml_diff>

<commit_message>
feat(orientacion): Word de remisión: recorrido y seguimiento como línea de tiempo en un solo recuadro (punto por entrada, título en negrilla con el área, quién y cuándo, contenido y firma de cada paso)
</commit_message>
<xml_diff>
--- a/public/remision_template.docx
+++ b/public/remision_template.docx
@@ -2411,31 +2411,24 @@
         <w:spacing w:after="80"/>
       </w:pPr>
     </w:p>
-    <w:p>
-      <w:pPr>
-        <w:spacing w:after="0"/>
-      </w:pPr>
-      <w:r>
-        <w:rPr>
-          <w:rFonts w:ascii="Calibri" w:hAnsi="Calibri" w:cs="Calibri" w:eastAsia="Calibri"/>
-          <w:b w:val="0"/>
-          <w:i w:val="0"/>
-          <w:color w:val="FFFFFF"/>
-          <w:sz w:val="2"/>
-        </w:rPr>
-        <w:t>{#ENTRADAS}</w:t>
-      </w:r>
-    </w:p>
     <w:tbl>
       <w:tblPr>
         <w:tblW w:type="dxa" w:w="10206"/>
         <w:tblLayout w:type="fixed"/>
         <w:tblLook w:firstColumn="1" w:firstRow="1" w:lastColumn="0" w:lastRow="0" w:noHBand="0" w:noVBand="1" w:val="04A0"/>
         <w:tblLayout w:type="fixed"/>
+        <w:tblBorders>
+          <w:top w:val="single" w:sz="4" w:space="0" w:color="B7C2BA"/>
+          <w:left w:val="single" w:sz="4" w:space="0" w:color="B7C2BA"/>
+          <w:bottom w:val="single" w:sz="4" w:space="0" w:color="B7C2BA"/>
+          <w:right w:val="single" w:sz="4" w:space="0" w:color="B7C2BA"/>
+          <w:insideH w:val="nil"/>
+          <w:insideV w:val="single" w:sz="6" w:space="0" w:color="9DB8A6"/>
+        </w:tblBorders>
       </w:tblPr>
       <w:tblGrid>
-        <w:gridCol w:w="3402"/>
-        <w:gridCol w:w="6804"/>
+        <w:gridCol w:w="510"/>
+        <w:gridCol w:w="9695"/>
       </w:tblGrid>
       <w:tr>
         <w:trPr>
@@ -2443,64 +2436,83 @@
         </w:trPr>
         <w:tc>
           <w:tcPr>
-            <w:tcW w:type="dxa" w:w="3402"/>
-            <w:shd w:val="clear" w:color="auto" w:fill="F2F5F3"/>
+            <w:tcW w:type="dxa" w:w="510"/>
             <w:tcMar>
-              <w:top w:w="70" w:type="dxa"/>
-              <w:bottom w:w="70" w:type="dxa"/>
-              <w:left w:w="120" w:type="dxa"/>
-              <w:right w:w="120" w:type="dxa"/>
+              <w:top w:w="0" w:type="dxa"/>
+              <w:bottom w:w="0" w:type="dxa"/>
+              <w:left w:w="0" w:type="dxa"/>
+              <w:right w:w="0" w:type="dxa"/>
             </w:tcMar>
-            <w:vAlign w:val="center"/>
-            <w:tcBorders>
-              <w:top w:val="single" w:sz="4" w:space="0" w:color="B7C2BA"/>
-              <w:left w:val="single" w:sz="4" w:space="0" w:color="B7C2BA"/>
-              <w:bottom w:val="single" w:sz="4" w:space="0" w:color="B7C2BA"/>
-              <w:right w:val="nil"/>
-            </w:tcBorders>
+          </w:tcPr>
+          <w:p>
+            <w:pPr>
+              <w:spacing w:before="0" w:after="0"/>
+            </w:pPr>
+            <w:r>
+              <w:rPr>
+                <w:rFonts w:ascii="Calibri" w:hAnsi="Calibri" w:cs="Calibri" w:eastAsia="Calibri"/>
+                <w:b w:val="0"/>
+                <w:i w:val="0"/>
+                <w:color w:val="FFFFFF"/>
+                <w:sz w:val="2"/>
+              </w:rPr>
+              <w:t>{#ENTRADAS}</w:t>
+            </w:r>
+          </w:p>
+        </w:tc>
+        <w:tc>
+          <w:tcPr>
+            <w:tcW w:type="dxa" w:w="9694"/>
+            <w:tcMar>
+              <w:top w:w="110" w:type="dxa"/>
+              <w:bottom w:w="160" w:type="dxa"/>
+              <w:left w:w="200" w:type="dxa"/>
+              <w:right w:w="160" w:type="dxa"/>
+            </w:tcMar>
           </w:tcPr>
           <w:p>
             <w:pPr>
               <w:keepNext/>
               <w:spacing w:before="0" w:after="0"/>
+              <w:ind w:left="-266"/>
             </w:pPr>
+            <w:r>
+              <w:rPr>
+                <w:rFonts w:ascii="Calibri" w:hAnsi="Calibri" w:cs="Calibri" w:eastAsia="Calibri"/>
+                <w:b w:val="0"/>
+                <w:i w:val="0"/>
+                <w:color w:val="0F6B3F"/>
+                <w:sz w:val="22"/>
+              </w:rPr>
+              <w:t>●</w:t>
+            </w:r>
+            <w:r>
+              <w:rPr>
+                <w:rFonts w:ascii="Calibri" w:hAnsi="Calibri" w:cs="Calibri" w:eastAsia="Calibri"/>
+                <w:b w:val="0"/>
+                <w:i w:val="0"/>
+                <w:color w:val="12241A"/>
+                <w:sz w:val="16"/>
+              </w:rPr>
+              <w:t xml:space="preserve">   </w:t>
+            </w:r>
             <w:r>
               <w:rPr>
                 <w:rFonts w:ascii="Calibri" w:hAnsi="Calibri" w:cs="Calibri" w:eastAsia="Calibri"/>
                 <w:b/>
                 <w:i w:val="0"/>
                 <w:color w:val="12241A"/>
-                <w:sz w:val="16"/>
+                <w:sz w:val="17"/>
                 <w:spacing w:val="24"/>
                 <w:caps w:val="1"/>
               </w:rPr>
               <w:t>{TITULO}</w:t>
             </w:r>
           </w:p>
-        </w:tc>
-        <w:tc>
-          <w:tcPr>
-            <w:tcW w:type="dxa" w:w="6803"/>
-            <w:shd w:val="clear" w:color="auto" w:fill="F2F5F3"/>
-            <w:tcMar>
-              <w:top w:w="70" w:type="dxa"/>
-              <w:bottom w:w="70" w:type="dxa"/>
-              <w:left w:w="120" w:type="dxa"/>
-              <w:right w:w="120" w:type="dxa"/>
-            </w:tcMar>
-            <w:vAlign w:val="center"/>
-            <w:tcBorders>
-              <w:top w:val="single" w:sz="4" w:space="0" w:color="B7C2BA"/>
-              <w:left w:val="nil"/>
-              <w:bottom w:val="single" w:sz="4" w:space="0" w:color="B7C2BA"/>
-              <w:right w:val="single" w:sz="4" w:space="0" w:color="B7C2BA"/>
-            </w:tcBorders>
-          </w:tcPr>
           <w:p>
             <w:pPr>
               <w:keepNext/>
-              <w:spacing w:before="0" w:after="0"/>
-              <w:jc w:val="right"/>
+              <w:spacing w:before="20" w:after="80"/>
             </w:pPr>
             <w:r>
               <w:rPr>
@@ -2513,29 +2525,6 @@
               <w:t>{META}</w:t>
             </w:r>
           </w:p>
-        </w:tc>
-      </w:tr>
-      <w:tr>
-        <w:trPr>
-          <w:cantSplit/>
-        </w:trPr>
-        <w:tc>
-          <w:tcPr>
-            <w:tcW w:type="dxa" w:w="10205"/>
-            <w:gridSpan w:val="2"/>
-            <w:tcMar>
-              <w:top w:w="110" w:type="dxa"/>
-              <w:bottom w:w="120" w:type="dxa"/>
-              <w:left w:w="140" w:type="dxa"/>
-              <w:right w:w="140" w:type="dxa"/>
-            </w:tcMar>
-            <w:tcBorders>
-              <w:top w:val="nil"/>
-              <w:left w:val="single" w:sz="4" w:space="0" w:color="B7C2BA"/>
-              <w:bottom w:val="single" w:sz="4" w:space="0" w:color="B7C2BA"/>
-              <w:right w:val="single" w:sz="4" w:space="0" w:color="B7C2BA"/>
-            </w:tcBorders>
-          </w:tcPr>
           <w:p>
             <w:pPr>
               <w:spacing w:before="0" w:after="0"/>
@@ -2553,6 +2542,7 @@
           </w:p>
           <w:p>
             <w:pPr>
+              <w:keepNext/>
               <w:spacing w:before="40" w:after="0"/>
             </w:pPr>
             <w:r>
@@ -2570,7 +2560,7 @@
           </w:p>
           <w:p>
             <w:pPr>
-              <w:spacing w:before="20" w:after="100" w:line="276" w:lineRule="auto"/>
+              <w:spacing w:before="20" w:after="80" w:line="276" w:lineRule="auto"/>
             </w:pPr>
             <w:r>
               <w:rPr>
@@ -2585,6 +2575,7 @@
           </w:p>
           <w:p>
             <w:pPr>
+              <w:keepNext/>
               <w:spacing w:before="40" w:after="0"/>
             </w:pPr>
             <w:r>
@@ -2602,7 +2593,7 @@
           </w:p>
           <w:p>
             <w:pPr>
-              <w:spacing w:before="20" w:after="100" w:line="276" w:lineRule="auto"/>
+              <w:spacing w:before="20" w:after="80" w:line="276" w:lineRule="auto"/>
             </w:pPr>
             <w:r>
               <w:rPr>
@@ -2617,6 +2608,7 @@
           </w:p>
           <w:p>
             <w:pPr>
+              <w:keepNext/>
               <w:spacing w:before="40" w:after="0"/>
             </w:pPr>
             <w:r>
@@ -2634,7 +2626,7 @@
           </w:p>
           <w:p>
             <w:pPr>
-              <w:spacing w:before="20" w:after="100" w:line="276" w:lineRule="auto"/>
+              <w:spacing w:before="20" w:after="80" w:line="276" w:lineRule="auto"/>
             </w:pPr>
             <w:r>
               <w:rPr>
@@ -2650,7 +2642,6 @@
           <w:p>
             <w:pPr>
               <w:spacing w:before="80" w:after="0"/>
-              <w:jc w:val="left"/>
             </w:pPr>
             <w:r>
               <w:rPr>
@@ -2722,7 +2713,7 @@
           </w:p>
           <w:p>
             <w:pPr>
-              <w:spacing w:before="20" w:after="40" w:line="276" w:lineRule="auto"/>
+              <w:spacing w:before="20" w:after="0" w:line="276" w:lineRule="auto"/>
             </w:pPr>
             <w:r>
               <w:rPr>
@@ -2750,44 +2741,24 @@
               <w:t>{/esNota}</w:t>
             </w:r>
           </w:p>
+          <w:p>
+            <w:pPr>
+              <w:spacing w:before="0" w:after="0"/>
+            </w:pPr>
+            <w:r>
+              <w:rPr>
+                <w:rFonts w:ascii="Calibri" w:hAnsi="Calibri" w:cs="Calibri" w:eastAsia="Calibri"/>
+                <w:b w:val="0"/>
+                <w:i w:val="0"/>
+                <w:color w:val="FFFFFF"/>
+                <w:sz w:val="2"/>
+              </w:rPr>
+              <w:t>{/ENTRADAS}</w:t>
+            </w:r>
+          </w:p>
         </w:tc>
       </w:tr>
     </w:tbl>
-    <w:p>
-      <w:pPr>
-        <w:spacing w:after="120"/>
-      </w:pPr>
-    </w:p>
-    <w:p>
-      <w:pPr>
-        <w:spacing w:after="0"/>
-      </w:pPr>
-      <w:r>
-        <w:rPr>
-          <w:rFonts w:ascii="Calibri" w:hAnsi="Calibri" w:cs="Calibri" w:eastAsia="Calibri"/>
-          <w:b w:val="0"/>
-          <w:i w:val="0"/>
-          <w:color w:val="FFFFFF"/>
-          <w:sz w:val="2"/>
-        </w:rPr>
-        <w:t>{/ENTRADAS}</w:t>
-      </w:r>
-    </w:p>
-    <w:p>
-      <w:pPr>
-        <w:spacing w:after="0"/>
-      </w:pPr>
-      <w:r>
-        <w:rPr>
-          <w:rFonts w:ascii="Georgia" w:hAnsi="Georgia" w:cs="Georgia" w:eastAsia="Georgia"/>
-          <w:b w:val="0"/>
-          <w:i w:val="0"/>
-          <w:color w:val="6D7A72"/>
-          <w:sz w:val="19"/>
-        </w:rPr>
-        <w:t>{#SIN_ENTRADAS}Sin pasos ni notas de seguimiento registrados.{/SIN_ENTRADAS}</w:t>
-      </w:r>
-    </w:p>
     <w:sectPr>
       <w:footerReference w:type="default" r:id="rId15"/>
       <w:pgSz w:w="12240" w:h="15840"/>

</xml_diff>

<commit_message>
feat(orientacion): Word de remisión: 6. Recorrido (remisiones a otras personas) y 7. Seguimiento (notas) en líneas de tiempo separadas, de la más nueva a la más antigua; sin la etiqueta 'Firma de quien remite'
</commit_message>
<xml_diff>
--- a/public/remision_template.docx
+++ b/public/remision_template.docx
@@ -2456,7 +2456,7 @@
                 <w:color w:val="FFFFFF"/>
                 <w:sz w:val="2"/>
               </w:rPr>
-              <w:t>{#ENTRADAS}</w:t>
+              <w:t>{#PASOS}</w:t>
             </w:r>
           </w:p>
         </w:tc>
@@ -2668,6 +2668,375 @@
               </w:rPr>
               <w:t>{QUIEN}</w:t>
             </w:r>
+          </w:p>
+          <w:p>
+            <w:pPr>
+              <w:spacing w:before="0" w:after="0"/>
+            </w:pPr>
+            <w:r>
+              <w:rPr>
+                <w:rFonts w:ascii="Calibri" w:hAnsi="Calibri" w:cs="Calibri" w:eastAsia="Calibri"/>
+                <w:b w:val="0"/>
+                <w:i w:val="0"/>
+                <w:color w:val="FFFFFF"/>
+                <w:sz w:val="2"/>
+              </w:rPr>
+              <w:t>{/esPaso}</w:t>
+            </w:r>
+          </w:p>
+          <w:p>
+            <w:pPr>
+              <w:spacing w:before="0" w:after="0"/>
+            </w:pPr>
+            <w:r>
+              <w:rPr>
+                <w:rFonts w:ascii="Calibri" w:hAnsi="Calibri" w:cs="Calibri" w:eastAsia="Calibri"/>
+                <w:b w:val="0"/>
+                <w:i w:val="0"/>
+                <w:color w:val="FFFFFF"/>
+                <w:sz w:val="2"/>
+              </w:rPr>
+              <w:t>{#esNota}</w:t>
+            </w:r>
+          </w:p>
+          <w:p>
+            <w:pPr>
+              <w:spacing w:before="20" w:after="0" w:line="276" w:lineRule="auto"/>
+            </w:pPr>
+            <w:r>
+              <w:rPr>
+                <w:rFonts w:ascii="Georgia" w:hAnsi="Georgia" w:cs="Georgia" w:eastAsia="Georgia"/>
+                <w:b w:val="0"/>
+                <w:i w:val="0"/>
+                <w:color w:val="12241A"/>
+                <w:sz w:val="20"/>
+              </w:rPr>
+              <w:t>{TEXTO}</w:t>
+            </w:r>
+          </w:p>
+          <w:p>
+            <w:pPr>
+              <w:spacing w:before="0" w:after="0"/>
+            </w:pPr>
+            <w:r>
+              <w:rPr>
+                <w:rFonts w:ascii="Calibri" w:hAnsi="Calibri" w:cs="Calibri" w:eastAsia="Calibri"/>
+                <w:b w:val="0"/>
+                <w:i w:val="0"/>
+                <w:color w:val="FFFFFF"/>
+                <w:sz w:val="2"/>
+              </w:rPr>
+              <w:t>{/esNota}</w:t>
+            </w:r>
+          </w:p>
+          <w:p>
+            <w:pPr>
+              <w:spacing w:before="0" w:after="0"/>
+            </w:pPr>
+            <w:r>
+              <w:rPr>
+                <w:rFonts w:ascii="Calibri" w:hAnsi="Calibri" w:cs="Calibri" w:eastAsia="Calibri"/>
+                <w:b w:val="0"/>
+                <w:i w:val="0"/>
+                <w:color w:val="FFFFFF"/>
+                <w:sz w:val="2"/>
+              </w:rPr>
+              <w:t>{/PASOS}</w:t>
+            </w:r>
+          </w:p>
+        </w:tc>
+      </w:tr>
+    </w:tbl>
+    <w:p>
+      <w:pPr>
+        <w:spacing w:after="120"/>
+      </w:pPr>
+    </w:p>
+    <w:tbl>
+      <w:tblPr>
+        <w:tblW w:type="dxa" w:w="10206"/>
+        <w:jc w:val="left"/>
+        <w:tblLayout w:type="fixed"/>
+        <w:tblLook w:firstColumn="1" w:firstRow="1" w:lastColumn="0" w:lastRow="0" w:noHBand="0" w:noVBand="1" w:val="04A0"/>
+        <w:tblBorders>
+          <w:top w:val="nil"/>
+          <w:left w:val="nil"/>
+          <w:bottom w:val="nil"/>
+          <w:right w:val="nil"/>
+          <w:insideH w:val="nil"/>
+          <w:insideV w:val="nil"/>
+        </w:tblBorders>
+        <w:tblLayout w:type="fixed"/>
+      </w:tblPr>
+      <w:tblGrid>
+        <w:gridCol w:w="453"/>
+        <w:gridCol w:w="5329"/>
+        <w:gridCol w:w="4422"/>
+      </w:tblGrid>
+      <w:tr>
+        <w:tc>
+          <w:tcPr>
+            <w:tcW w:type="dxa" w:w="454"/>
+            <w:vAlign w:val="center"/>
+            <w:tcMar>
+              <w:top w:w="0" w:type="dxa"/>
+              <w:bottom w:w="0" w:type="dxa"/>
+              <w:left w:w="0" w:type="dxa"/>
+              <w:right w:w="0" w:type="dxa"/>
+            </w:tcMar>
+          </w:tcPr>
+          <w:p>
+            <w:pPr>
+              <w:keepNext/>
+              <w:spacing w:before="0" w:after="0"/>
+            </w:pPr>
+            <w:r>
+              <w:drawing>
+                <wp:inline xmlns:a="http://schemas.openxmlformats.org/drawingml/2006/main" xmlns:pic="http://schemas.openxmlformats.org/drawingml/2006/picture">
+                  <wp:extent cx="180000" cy="180000"/>
+                  <wp:docPr id="7" name="Picture 7"/>
+                  <wp:cNvGraphicFramePr>
+                    <a:graphicFrameLocks noChangeAspect="1"/>
+                  </wp:cNvGraphicFramePr>
+                  <a:graphic>
+                    <a:graphicData uri="http://schemas.openxmlformats.org/drawingml/2006/picture">
+                      <pic:pic>
+                        <pic:nvPicPr>
+                          <pic:cNvPr id="0" name="circ_7.png"/>
+                          <pic:cNvPicPr/>
+                        </pic:nvPicPr>
+                        <pic:blipFill>
+                          <a:blip r:embed="rId15"/>
+                          <a:stretch>
+                            <a:fillRect/>
+                          </a:stretch>
+                        </pic:blipFill>
+                        <pic:spPr>
+                          <a:xfrm>
+                            <a:off x="0" y="0"/>
+                            <a:ext cx="180000" cy="180000"/>
+                          </a:xfrm>
+                          <a:prstGeom prst="rect"/>
+                        </pic:spPr>
+                      </pic:pic>
+                    </a:graphicData>
+                  </a:graphic>
+                </wp:inline>
+              </w:drawing>
+            </w:r>
+          </w:p>
+        </w:tc>
+        <w:tc>
+          <w:tcPr>
+            <w:tcW w:type="dxa" w:w="5329"/>
+            <w:vAlign w:val="center"/>
+            <w:tcMar>
+              <w:top w:w="0" w:type="dxa"/>
+              <w:bottom w:w="0" w:type="dxa"/>
+              <w:left w:w="0" w:type="dxa"/>
+              <w:right w:w="0" w:type="dxa"/>
+            </w:tcMar>
+            <w:tcMar>
+              <w:top w:w="0" w:type="dxa"/>
+              <w:bottom w:w="0" w:type="dxa"/>
+              <w:left w:w="100" w:type="dxa"/>
+              <w:right w:w="0" w:type="dxa"/>
+            </w:tcMar>
+          </w:tcPr>
+          <w:p>
+            <w:pPr>
+              <w:keepNext/>
+              <w:spacing w:before="0" w:after="0"/>
+            </w:pPr>
+            <w:r>
+              <w:rPr>
+                <w:rFonts w:ascii="Calibri" w:hAnsi="Calibri" w:cs="Calibri" w:eastAsia="Calibri"/>
+                <w:b/>
+                <w:i w:val="0"/>
+                <w:color w:val="12241A"/>
+                <w:sz w:val="17"/>
+                <w:spacing w:val="28"/>
+                <w:caps w:val="1"/>
+              </w:rPr>
+              <w:t>Seguimiento</w:t>
+            </w:r>
+          </w:p>
+        </w:tc>
+        <w:tc>
+          <w:tcPr>
+            <w:tcW w:type="dxa" w:w="4422"/>
+            <w:vAlign w:val="center"/>
+            <w:tcMar>
+              <w:top w:w="0" w:type="dxa"/>
+              <w:bottom w:w="0" w:type="dxa"/>
+              <w:left w:w="0" w:type="dxa"/>
+              <w:right w:w="0" w:type="dxa"/>
+            </w:tcMar>
+            <w:tcMar>
+              <w:top w:w="0" w:type="dxa"/>
+              <w:bottom w:w="60" w:type="dxa"/>
+              <w:left w:w="120" w:type="dxa"/>
+              <w:right w:w="0" w:type="dxa"/>
+            </w:tcMar>
+          </w:tcPr>
+          <w:p>
+            <w:pPr>
+              <w:spacing w:before="0" w:after="0"/>
+              <w:keepNext/>
+              <w:pBdr>
+                <w:bottom w:val="single" w:sz="4" w:space="0" w:color="B7C2BA"/>
+              </w:pBdr>
+            </w:pPr>
+            <w:r>
+              <w:rPr>
+                <w:sz w:val="6"/>
+              </w:rPr>
+              <w:t xml:space="preserve"> </w:t>
+            </w:r>
+          </w:p>
+        </w:tc>
+      </w:tr>
+    </w:tbl>
+    <w:p>
+      <w:pPr>
+        <w:keepNext/>
+        <w:spacing w:after="0"/>
+      </w:pPr>
+    </w:p>
+    <w:tbl>
+      <w:tblPr>
+        <w:tblW w:type="dxa" w:w="10206"/>
+        <w:tblLayout w:type="fixed"/>
+        <w:tblLook w:firstColumn="1" w:firstRow="1" w:lastColumn="0" w:lastRow="0" w:noHBand="0" w:noVBand="1" w:val="04A0"/>
+        <w:tblLayout w:type="fixed"/>
+        <w:tblBorders>
+          <w:top w:val="single" w:sz="4" w:space="0" w:color="B7C2BA"/>
+          <w:left w:val="single" w:sz="4" w:space="0" w:color="B7C2BA"/>
+          <w:bottom w:val="single" w:sz="4" w:space="0" w:color="B7C2BA"/>
+          <w:right w:val="single" w:sz="4" w:space="0" w:color="B7C2BA"/>
+          <w:insideH w:val="nil"/>
+          <w:insideV w:val="single" w:sz="6" w:space="0" w:color="9DB8A6"/>
+        </w:tblBorders>
+      </w:tblPr>
+      <w:tblGrid>
+        <w:gridCol w:w="510"/>
+        <w:gridCol w:w="9695"/>
+      </w:tblGrid>
+      <w:tr>
+        <w:trPr>
+          <w:cantSplit/>
+        </w:trPr>
+        <w:tc>
+          <w:tcPr>
+            <w:tcW w:type="dxa" w:w="510"/>
+            <w:tcMar>
+              <w:top w:w="0" w:type="dxa"/>
+              <w:bottom w:w="0" w:type="dxa"/>
+              <w:left w:w="0" w:type="dxa"/>
+              <w:right w:w="0" w:type="dxa"/>
+            </w:tcMar>
+          </w:tcPr>
+          <w:p>
+            <w:pPr>
+              <w:spacing w:before="0" w:after="0"/>
+            </w:pPr>
+            <w:r>
+              <w:rPr>
+                <w:rFonts w:ascii="Calibri" w:hAnsi="Calibri" w:cs="Calibri" w:eastAsia="Calibri"/>
+                <w:b w:val="0"/>
+                <w:i w:val="0"/>
+                <w:color w:val="FFFFFF"/>
+                <w:sz w:val="2"/>
+              </w:rPr>
+              <w:t>{#NOTAS}</w:t>
+            </w:r>
+          </w:p>
+        </w:tc>
+        <w:tc>
+          <w:tcPr>
+            <w:tcW w:type="dxa" w:w="9694"/>
+            <w:tcMar>
+              <w:top w:w="110" w:type="dxa"/>
+              <w:bottom w:w="160" w:type="dxa"/>
+              <w:left w:w="200" w:type="dxa"/>
+              <w:right w:w="160" w:type="dxa"/>
+            </w:tcMar>
+          </w:tcPr>
+          <w:p>
+            <w:pPr>
+              <w:keepNext/>
+              <w:spacing w:before="0" w:after="0"/>
+              <w:ind w:left="-266"/>
+            </w:pPr>
+            <w:r>
+              <w:rPr>
+                <w:rFonts w:ascii="Calibri" w:hAnsi="Calibri" w:cs="Calibri" w:eastAsia="Calibri"/>
+                <w:b w:val="0"/>
+                <w:i w:val="0"/>
+                <w:color w:val="0F6B3F"/>
+                <w:sz w:val="22"/>
+              </w:rPr>
+              <w:t>●</w:t>
+            </w:r>
+            <w:r>
+              <w:rPr>
+                <w:rFonts w:ascii="Calibri" w:hAnsi="Calibri" w:cs="Calibri" w:eastAsia="Calibri"/>
+                <w:b w:val="0"/>
+                <w:i w:val="0"/>
+                <w:color w:val="12241A"/>
+                <w:sz w:val="16"/>
+              </w:rPr>
+              <w:t xml:space="preserve">   </w:t>
+            </w:r>
+            <w:r>
+              <w:rPr>
+                <w:rFonts w:ascii="Calibri" w:hAnsi="Calibri" w:cs="Calibri" w:eastAsia="Calibri"/>
+                <w:b/>
+                <w:i w:val="0"/>
+                <w:color w:val="12241A"/>
+                <w:sz w:val="17"/>
+                <w:spacing w:val="24"/>
+                <w:caps w:val="1"/>
+              </w:rPr>
+              <w:t>{TITULO}</w:t>
+            </w:r>
+          </w:p>
+          <w:p>
+            <w:pPr>
+              <w:keepNext/>
+              <w:spacing w:before="20" w:after="80"/>
+            </w:pPr>
+            <w:r>
+              <w:rPr>
+                <w:rFonts w:ascii="Calibri" w:hAnsi="Calibri" w:cs="Calibri" w:eastAsia="Calibri"/>
+                <w:b w:val="0"/>
+                <w:i w:val="0"/>
+                <w:color w:val="6D7A72"/>
+                <w:sz w:val="15"/>
+              </w:rPr>
+              <w:t>{META}</w:t>
+            </w:r>
+          </w:p>
+          <w:p>
+            <w:pPr>
+              <w:spacing w:before="0" w:after="0"/>
+            </w:pPr>
+            <w:r>
+              <w:rPr>
+                <w:rFonts w:ascii="Calibri" w:hAnsi="Calibri" w:cs="Calibri" w:eastAsia="Calibri"/>
+                <w:b w:val="0"/>
+                <w:i w:val="0"/>
+                <w:color w:val="FFFFFF"/>
+                <w:sz w:val="2"/>
+              </w:rPr>
+              <w:t>{#esPaso}</w:t>
+            </w:r>
+          </w:p>
+          <w:p>
+            <w:pPr>
+              <w:keepNext/>
+              <w:spacing w:before="40" w:after="0"/>
+            </w:pPr>
             <w:r>
               <w:rPr>
                 <w:rFonts w:ascii="Calibri" w:hAnsi="Calibri" w:cs="Calibri" w:eastAsia="Calibri"/>
@@ -2675,10 +3044,121 @@
                 <w:i w:val="0"/>
                 <w:color w:val="6D7A72"/>
                 <w:sz w:val="13"/>
-                <w:spacing w:val="18"/>
+                <w:spacing w:val="24"/>
                 <w:caps w:val="1"/>
               </w:rPr>
-              <w:t xml:space="preserve">   Firma de quien remite</w:t>
+              <w:t>Motivo</w:t>
+            </w:r>
+          </w:p>
+          <w:p>
+            <w:pPr>
+              <w:spacing w:before="20" w:after="80" w:line="276" w:lineRule="auto"/>
+            </w:pPr>
+            <w:r>
+              <w:rPr>
+                <w:rFonts w:ascii="Georgia" w:hAnsi="Georgia" w:cs="Georgia" w:eastAsia="Georgia"/>
+                <w:b w:val="0"/>
+                <w:i w:val="0"/>
+                <w:color w:val="12241A"/>
+                <w:sz w:val="20"/>
+              </w:rPr>
+              <w:t>{MOTIVO}</w:t>
+            </w:r>
+          </w:p>
+          <w:p>
+            <w:pPr>
+              <w:keepNext/>
+              <w:spacing w:before="40" w:after="0"/>
+            </w:pPr>
+            <w:r>
+              <w:rPr>
+                <w:rFonts w:ascii="Calibri" w:hAnsi="Calibri" w:cs="Calibri" w:eastAsia="Calibri"/>
+                <w:b w:val="0"/>
+                <w:i w:val="0"/>
+                <w:color w:val="6D7A72"/>
+                <w:sz w:val="13"/>
+                <w:spacing w:val="24"/>
+                <w:caps w:val="1"/>
+              </w:rPr>
+              <w:t>Especificación de la conducta</w:t>
+            </w:r>
+          </w:p>
+          <w:p>
+            <w:pPr>
+              <w:spacing w:before="20" w:after="80" w:line="276" w:lineRule="auto"/>
+            </w:pPr>
+            <w:r>
+              <w:rPr>
+                <w:rFonts w:ascii="Georgia" w:hAnsi="Georgia" w:cs="Georgia" w:eastAsia="Georgia"/>
+                <w:b w:val="0"/>
+                <w:i w:val="0"/>
+                <w:color w:val="12241A"/>
+                <w:sz w:val="20"/>
+              </w:rPr>
+              <w:t>{ESPECIFICACION}</w:t>
+            </w:r>
+          </w:p>
+          <w:p>
+            <w:pPr>
+              <w:keepNext/>
+              <w:spacing w:before="40" w:after="0"/>
+            </w:pPr>
+            <w:r>
+              <w:rPr>
+                <w:rFonts w:ascii="Calibri" w:hAnsi="Calibri" w:cs="Calibri" w:eastAsia="Calibri"/>
+                <w:b w:val="0"/>
+                <w:i w:val="0"/>
+                <w:color w:val="6D7A72"/>
+                <w:sz w:val="13"/>
+                <w:spacing w:val="24"/>
+                <w:caps w:val="1"/>
+              </w:rPr>
+              <w:t>Medidas pedagógicas aplicadas</w:t>
+            </w:r>
+          </w:p>
+          <w:p>
+            <w:pPr>
+              <w:spacing w:before="20" w:after="80" w:line="276" w:lineRule="auto"/>
+            </w:pPr>
+            <w:r>
+              <w:rPr>
+                <w:rFonts w:ascii="Georgia" w:hAnsi="Georgia" w:cs="Georgia" w:eastAsia="Georgia"/>
+                <w:b w:val="0"/>
+                <w:i w:val="0"/>
+                <w:color w:val="12241A"/>
+                <w:sz w:val="20"/>
+              </w:rPr>
+              <w:t>{MEDIDAS}</w:t>
+            </w:r>
+          </w:p>
+          <w:p>
+            <w:pPr>
+              <w:spacing w:before="80" w:after="0"/>
+            </w:pPr>
+            <w:r>
+              <w:rPr>
+                <w:rFonts w:ascii="Calibri" w:hAnsi="Calibri" w:cs="Calibri" w:eastAsia="Calibri"/>
+                <w:b w:val="0"/>
+                <w:i w:val="0"/>
+                <w:color w:val="6D7A72"/>
+                <w:sz w:val="12"/>
+              </w:rPr>
+              <w:t>{FIRMA_TAG}</w:t>
+            </w:r>
+          </w:p>
+          <w:p>
+            <w:pPr>
+              <w:spacing w:before="20" w:after="0"/>
+            </w:pPr>
+            <w:r>
+              <w:rPr>
+                <w:rFonts w:ascii="Georgia" w:hAnsi="Georgia" w:cs="Georgia" w:eastAsia="Georgia"/>
+                <w:b w:val="0"/>
+                <w:i w:val="0"/>
+                <w:color w:val="12241A"/>
+                <w:sz w:val="19"/>
+              </w:rPr>
+              <w:t>{QUIEN}</w:t>
             </w:r>
           </w:p>
           <w:p>
@@ -2753,14 +3233,14 @@
                 <w:color w:val="FFFFFF"/>
                 <w:sz w:val="2"/>
               </w:rPr>
-              <w:t>{/ENTRADAS}</w:t>
+              <w:t>{/NOTAS}</w:t>
             </w:r>
           </w:p>
         </w:tc>
       </w:tr>
     </w:tbl>
     <w:sectPr>
-      <w:footerReference w:type="default" r:id="rId15"/>
+      <w:footerReference w:type="default" r:id="rId16"/>
       <w:pgSz w:w="12240" w:h="15840"/>
       <w:pgMar w:top="907" w:right="1020" w:bottom="907" w:left="1020" w:header="720" w:footer="510" w:gutter="0"/>
       <w:cols w:space="720"/>

</xml_diff>

<commit_message>
feat(orientacion): Word de remisión: cada nota de seguimiento va debajo de la remisión (original o paso) en la que se escribió; recorrido de la más nueva a la más antigua
</commit_message>
<xml_diff>
--- a/public/remision_template.docx
+++ b/public/remision_template.docx
@@ -2033,6 +2033,214 @@
         <w:spacing w:after="160"/>
       </w:pPr>
     </w:p>
+    <w:p>
+      <w:pPr>
+        <w:spacing w:after="0"/>
+      </w:pPr>
+      <w:r>
+        <w:rPr>
+          <w:rFonts w:ascii="Calibri" w:hAnsi="Calibri" w:cs="Calibri" w:eastAsia="Calibri"/>
+          <w:b w:val="0"/>
+          <w:i w:val="0"/>
+          <w:color w:val="FFFFFF"/>
+          <w:sz w:val="2"/>
+        </w:rPr>
+        <w:t>{#HAY_NOTAS0}</w:t>
+      </w:r>
+    </w:p>
+    <w:tbl>
+      <w:tblPr>
+        <w:tblW w:type="dxa" w:w="10206"/>
+        <w:tblLayout w:type="fixed"/>
+        <w:tblLook w:firstColumn="1" w:firstRow="1" w:lastColumn="0" w:lastRow="0" w:noHBand="0" w:noVBand="1" w:val="04A0"/>
+        <w:tblLayout w:type="fixed"/>
+      </w:tblPr>
+      <w:tblGrid>
+        <w:gridCol w:w="10206"/>
+      </w:tblGrid>
+      <w:tr>
+        <w:tc>
+          <w:tcPr>
+            <w:tcW w:type="dxa" w:w="10205"/>
+            <w:tcMar>
+              <w:top w:w="60" w:type="dxa"/>
+              <w:bottom w:w="140" w:type="dxa"/>
+              <w:left w:w="200" w:type="dxa"/>
+              <w:right w:w="160" w:type="dxa"/>
+            </w:tcMar>
+            <w:tcBorders>
+              <w:top w:val="single" w:sz="4" w:space="0" w:color="B7C2BA"/>
+              <w:left w:val="single" w:sz="4" w:space="0" w:color="B7C2BA"/>
+              <w:bottom w:val="single" w:sz="4" w:space="0" w:color="B7C2BA"/>
+              <w:right w:val="single" w:sz="4" w:space="0" w:color="B7C2BA"/>
+            </w:tcBorders>
+          </w:tcPr>
+          <w:p>
+            <w:pPr>
+              <w:spacing w:after="0" w:before="0"/>
+            </w:pPr>
+            <w:r>
+              <w:rPr>
+                <w:sz w:val="2"/>
+              </w:rPr>
+            </w:r>
+          </w:p>
+          <w:p>
+            <w:pPr>
+              <w:spacing w:before="0" w:after="0"/>
+            </w:pPr>
+            <w:r>
+              <w:rPr>
+                <w:rFonts w:ascii="Calibri" w:hAnsi="Calibri" w:cs="Calibri" w:eastAsia="Calibri"/>
+                <w:b w:val="0"/>
+                <w:i w:val="0"/>
+                <w:color w:val="FFFFFF"/>
+                <w:sz w:val="2"/>
+              </w:rPr>
+              <w:t>{#HAY_NOTAS0}</w:t>
+            </w:r>
+          </w:p>
+          <w:p>
+            <w:pPr>
+              <w:keepNext/>
+              <w:spacing w:before="160" w:after="0"/>
+            </w:pPr>
+            <w:r>
+              <w:rPr>
+                <w:rFonts w:ascii="Calibri" w:hAnsi="Calibri" w:cs="Calibri" w:eastAsia="Calibri"/>
+                <w:b w:val="0"/>
+                <w:i w:val="0"/>
+                <w:color w:val="6D7A72"/>
+                <w:sz w:val="13"/>
+                <w:spacing w:val="24"/>
+                <w:caps w:val="1"/>
+              </w:rPr>
+              <w:t>Seguimiento</w:t>
+            </w:r>
+          </w:p>
+          <w:p>
+            <w:pPr>
+              <w:spacing w:before="0" w:after="0"/>
+            </w:pPr>
+            <w:r>
+              <w:rPr>
+                <w:rFonts w:ascii="Calibri" w:hAnsi="Calibri" w:cs="Calibri" w:eastAsia="Calibri"/>
+                <w:b w:val="0"/>
+                <w:i w:val="0"/>
+                <w:color w:val="FFFFFF"/>
+                <w:sz w:val="2"/>
+              </w:rPr>
+              <w:t>{/HAY_NOTAS0}</w:t>
+            </w:r>
+          </w:p>
+          <w:p>
+            <w:pPr>
+              <w:spacing w:before="0" w:after="0"/>
+            </w:pPr>
+            <w:r>
+              <w:rPr>
+                <w:rFonts w:ascii="Calibri" w:hAnsi="Calibri" w:cs="Calibri" w:eastAsia="Calibri"/>
+                <w:b w:val="0"/>
+                <w:i w:val="0"/>
+                <w:color w:val="FFFFFF"/>
+                <w:sz w:val="2"/>
+              </w:rPr>
+              <w:t>{#NOTAS0}</w:t>
+            </w:r>
+          </w:p>
+          <w:p>
+            <w:pPr>
+              <w:keepNext/>
+              <w:spacing w:before="100" w:after="0"/>
+              <w:ind w:left="283"/>
+            </w:pPr>
+            <w:r>
+              <w:rPr>
+                <w:rFonts w:ascii="Calibri" w:hAnsi="Calibri" w:cs="Calibri" w:eastAsia="Calibri"/>
+                <w:b w:val="0"/>
+                <w:i w:val="0"/>
+                <w:color w:val="8A958E"/>
+                <w:sz w:val="16"/>
+              </w:rPr>
+              <w:t xml:space="preserve">○  </w:t>
+            </w:r>
+            <w:r>
+              <w:rPr>
+                <w:rFonts w:ascii="Calibri" w:hAnsi="Calibri" w:cs="Calibri" w:eastAsia="Calibri"/>
+                <w:b/>
+                <w:i w:val="0"/>
+                <w:color w:val="12241A"/>
+                <w:sz w:val="15"/>
+                <w:spacing w:val="20"/>
+                <w:caps w:val="1"/>
+              </w:rPr>
+              <w:t>{TITULO}</w:t>
+            </w:r>
+            <w:r>
+              <w:rPr>
+                <w:rFonts w:ascii="Calibri" w:hAnsi="Calibri" w:cs="Calibri" w:eastAsia="Calibri"/>
+                <w:b w:val="0"/>
+                <w:i w:val="0"/>
+                <w:color w:val="6D7A72"/>
+                <w:sz w:val="15"/>
+              </w:rPr>
+              <w:t xml:space="preserve">   ·   {META}</w:t>
+            </w:r>
+          </w:p>
+          <w:p>
+            <w:pPr>
+              <w:spacing w:before="20" w:after="40" w:line="276" w:lineRule="auto"/>
+              <w:ind w:left="283"/>
+            </w:pPr>
+            <w:r>
+              <w:rPr>
+                <w:rFonts w:ascii="Georgia" w:hAnsi="Georgia" w:cs="Georgia" w:eastAsia="Georgia"/>
+                <w:b w:val="0"/>
+                <w:i w:val="0"/>
+                <w:color w:val="12241A"/>
+                <w:sz w:val="19"/>
+              </w:rPr>
+              <w:t>{TEXTO}</w:t>
+            </w:r>
+          </w:p>
+          <w:p>
+            <w:pPr>
+              <w:spacing w:before="0" w:after="0"/>
+            </w:pPr>
+            <w:r>
+              <w:rPr>
+                <w:rFonts w:ascii="Calibri" w:hAnsi="Calibri" w:cs="Calibri" w:eastAsia="Calibri"/>
+                <w:b w:val="0"/>
+                <w:i w:val="0"/>
+                <w:color w:val="FFFFFF"/>
+                <w:sz w:val="2"/>
+              </w:rPr>
+              <w:t>{/NOTAS0}</w:t>
+            </w:r>
+          </w:p>
+        </w:tc>
+      </w:tr>
+    </w:tbl>
+    <w:p>
+      <w:pPr>
+        <w:spacing w:after="120"/>
+      </w:pPr>
+    </w:p>
+    <w:p>
+      <w:pPr>
+        <w:spacing w:after="0"/>
+      </w:pPr>
+      <w:r>
+        <w:rPr>
+          <w:rFonts w:ascii="Calibri" w:hAnsi="Calibri" w:cs="Calibri" w:eastAsia="Calibri"/>
+          <w:b w:val="0"/>
+          <w:i w:val="0"/>
+          <w:color w:val="FFFFFF"/>
+          <w:sz w:val="2"/>
+        </w:rPr>
+        <w:t>{/HAY_NOTAS0}</w:t>
+      </w:r>
+    </w:p>
     <w:tbl>
       <w:tblPr>
         <w:tblW w:type="dxa" w:w="10206"/>
@@ -2411,6 +2619,21 @@
         <w:spacing w:after="80"/>
       </w:pPr>
     </w:p>
+    <w:p>
+      <w:pPr>
+        <w:spacing w:after="0"/>
+      </w:pPr>
+      <w:r>
+        <w:rPr>
+          <w:rFonts w:ascii="Calibri" w:hAnsi="Calibri" w:cs="Calibri" w:eastAsia="Calibri"/>
+          <w:b w:val="0"/>
+          <w:i w:val="0"/>
+          <w:color w:val="FFFFFF"/>
+          <w:sz w:val="2"/>
+        </w:rPr>
+        <w:t>{#HAY_PASOS}</w:t>
+      </w:r>
+    </w:p>
     <w:tbl>
       <w:tblPr>
         <w:tblW w:type="dxa" w:w="10206"/>
@@ -2523,21 +2746,6 @@
                 <w:sz w:val="15"/>
               </w:rPr>
               <w:t>{META}</w:t>
-            </w:r>
-          </w:p>
-          <w:p>
-            <w:pPr>
-              <w:spacing w:before="0" w:after="0"/>
-            </w:pPr>
-            <w:r>
-              <w:rPr>
-                <w:rFonts w:ascii="Calibri" w:hAnsi="Calibri" w:cs="Calibri" w:eastAsia="Calibri"/>
-                <w:b w:val="0"/>
-                <w:i w:val="0"/>
-                <w:color w:val="FFFFFF"/>
-                <w:sz w:val="2"/>
-              </w:rPr>
-              <w:t>{#esPaso}</w:t>
             </w:r>
           </w:p>
           <w:p>
@@ -2681,7 +2889,25 @@
                 <w:color w:val="FFFFFF"/>
                 <w:sz w:val="2"/>
               </w:rPr>
-              <w:t>{/esPaso}</w:t>
+              <w:t>{#HAY_NOTAS}</w:t>
+            </w:r>
+          </w:p>
+          <w:p>
+            <w:pPr>
+              <w:keepNext/>
+              <w:spacing w:before="160" w:after="0"/>
+            </w:pPr>
+            <w:r>
+              <w:rPr>
+                <w:rFonts w:ascii="Calibri" w:hAnsi="Calibri" w:cs="Calibri" w:eastAsia="Calibri"/>
+                <w:b w:val="0"/>
+                <w:i w:val="0"/>
+                <w:color w:val="6D7A72"/>
+                <w:sz w:val="13"/>
+                <w:spacing w:val="24"/>
+                <w:caps w:val="1"/>
+              </w:rPr>
+              <w:t>Seguimiento</w:t>
             </w:r>
           </w:p>
           <w:p>
@@ -2696,12 +2922,67 @@
                 <w:color w:val="FFFFFF"/>
                 <w:sz w:val="2"/>
               </w:rPr>
-              <w:t>{#esNota}</w:t>
+              <w:t>{/HAY_NOTAS}</w:t>
             </w:r>
           </w:p>
           <w:p>
             <w:pPr>
-              <w:spacing w:before="20" w:after="0" w:line="276" w:lineRule="auto"/>
+              <w:spacing w:before="0" w:after="0"/>
+            </w:pPr>
+            <w:r>
+              <w:rPr>
+                <w:rFonts w:ascii="Calibri" w:hAnsi="Calibri" w:cs="Calibri" w:eastAsia="Calibri"/>
+                <w:b w:val="0"/>
+                <w:i w:val="0"/>
+                <w:color w:val="FFFFFF"/>
+                <w:sz w:val="2"/>
+              </w:rPr>
+              <w:t>{#NOTAS}</w:t>
+            </w:r>
+          </w:p>
+          <w:p>
+            <w:pPr>
+              <w:keepNext/>
+              <w:spacing w:before="100" w:after="0"/>
+              <w:ind w:left="283"/>
+            </w:pPr>
+            <w:r>
+              <w:rPr>
+                <w:rFonts w:ascii="Calibri" w:hAnsi="Calibri" w:cs="Calibri" w:eastAsia="Calibri"/>
+                <w:b w:val="0"/>
+                <w:i w:val="0"/>
+                <w:color w:val="8A958E"/>
+                <w:sz w:val="16"/>
+              </w:rPr>
+              <w:t xml:space="preserve">○  </w:t>
+            </w:r>
+            <w:r>
+              <w:rPr>
+                <w:rFonts w:ascii="Calibri" w:hAnsi="Calibri" w:cs="Calibri" w:eastAsia="Calibri"/>
+                <w:b/>
+                <w:i w:val="0"/>
+                <w:color w:val="12241A"/>
+                <w:sz w:val="15"/>
+                <w:spacing w:val="20"/>
+                <w:caps w:val="1"/>
+              </w:rPr>
+              <w:t>{TITULO}</w:t>
+            </w:r>
+            <w:r>
+              <w:rPr>
+                <w:rFonts w:ascii="Calibri" w:hAnsi="Calibri" w:cs="Calibri" w:eastAsia="Calibri"/>
+                <w:b w:val="0"/>
+                <w:i w:val="0"/>
+                <w:color w:val="6D7A72"/>
+                <w:sz w:val="15"/>
+              </w:rPr>
+              <w:t xml:space="preserve">   ·   {META}</w:t>
+            </w:r>
+          </w:p>
+          <w:p>
+            <w:pPr>
+              <w:spacing w:before="20" w:after="40" w:line="276" w:lineRule="auto"/>
+              <w:ind w:left="283"/>
             </w:pPr>
             <w:r>
               <w:rPr>
@@ -2709,7 +2990,7 @@
                 <w:b w:val="0"/>
                 <w:i w:val="0"/>
                 <w:color w:val="12241A"/>
-                <w:sz w:val="20"/>
+                <w:sz w:val="19"/>
               </w:rPr>
               <w:t>{TEXTO}</w:t>
             </w:r>
@@ -2726,7 +3007,7 @@
                 <w:color w:val="FFFFFF"/>
                 <w:sz w:val="2"/>
               </w:rPr>
-              <w:t>{/esNota}</w:t>
+              <w:t>{/NOTAS}</w:t>
             </w:r>
           </w:p>
           <w:p>
@@ -2749,498 +3030,33 @@
     </w:tbl>
     <w:p>
       <w:pPr>
-        <w:spacing w:after="120"/>
-      </w:pPr>
-    </w:p>
-    <w:tbl>
-      <w:tblPr>
-        <w:tblW w:type="dxa" w:w="10206"/>
-        <w:jc w:val="left"/>
-        <w:tblLayout w:type="fixed"/>
-        <w:tblLook w:firstColumn="1" w:firstRow="1" w:lastColumn="0" w:lastRow="0" w:noHBand="0" w:noVBand="1" w:val="04A0"/>
-        <w:tblBorders>
-          <w:top w:val="nil"/>
-          <w:left w:val="nil"/>
-          <w:bottom w:val="nil"/>
-          <w:right w:val="nil"/>
-          <w:insideH w:val="nil"/>
-          <w:insideV w:val="nil"/>
-        </w:tblBorders>
-        <w:tblLayout w:type="fixed"/>
-      </w:tblPr>
-      <w:tblGrid>
-        <w:gridCol w:w="453"/>
-        <w:gridCol w:w="5329"/>
-        <w:gridCol w:w="4422"/>
-      </w:tblGrid>
-      <w:tr>
-        <w:tc>
-          <w:tcPr>
-            <w:tcW w:type="dxa" w:w="454"/>
-            <w:vAlign w:val="center"/>
-            <w:tcMar>
-              <w:top w:w="0" w:type="dxa"/>
-              <w:bottom w:w="0" w:type="dxa"/>
-              <w:left w:w="0" w:type="dxa"/>
-              <w:right w:w="0" w:type="dxa"/>
-            </w:tcMar>
-          </w:tcPr>
-          <w:p>
-            <w:pPr>
-              <w:keepNext/>
-              <w:spacing w:before="0" w:after="0"/>
-            </w:pPr>
-            <w:r>
-              <w:drawing>
-                <wp:inline xmlns:a="http://schemas.openxmlformats.org/drawingml/2006/main" xmlns:pic="http://schemas.openxmlformats.org/drawingml/2006/picture">
-                  <wp:extent cx="180000" cy="180000"/>
-                  <wp:docPr id="7" name="Picture 7"/>
-                  <wp:cNvGraphicFramePr>
-                    <a:graphicFrameLocks noChangeAspect="1"/>
-                  </wp:cNvGraphicFramePr>
-                  <a:graphic>
-                    <a:graphicData uri="http://schemas.openxmlformats.org/drawingml/2006/picture">
-                      <pic:pic>
-                        <pic:nvPicPr>
-                          <pic:cNvPr id="0" name="circ_7.png"/>
-                          <pic:cNvPicPr/>
-                        </pic:nvPicPr>
-                        <pic:blipFill>
-                          <a:blip r:embed="rId15"/>
-                          <a:stretch>
-                            <a:fillRect/>
-                          </a:stretch>
-                        </pic:blipFill>
-                        <pic:spPr>
-                          <a:xfrm>
-                            <a:off x="0" y="0"/>
-                            <a:ext cx="180000" cy="180000"/>
-                          </a:xfrm>
-                          <a:prstGeom prst="rect"/>
-                        </pic:spPr>
-                      </pic:pic>
-                    </a:graphicData>
-                  </a:graphic>
-                </wp:inline>
-              </w:drawing>
-            </w:r>
-          </w:p>
-        </w:tc>
-        <w:tc>
-          <w:tcPr>
-            <w:tcW w:type="dxa" w:w="5329"/>
-            <w:vAlign w:val="center"/>
-            <w:tcMar>
-              <w:top w:w="0" w:type="dxa"/>
-              <w:bottom w:w="0" w:type="dxa"/>
-              <w:left w:w="0" w:type="dxa"/>
-              <w:right w:w="0" w:type="dxa"/>
-            </w:tcMar>
-            <w:tcMar>
-              <w:top w:w="0" w:type="dxa"/>
-              <w:bottom w:w="0" w:type="dxa"/>
-              <w:left w:w="100" w:type="dxa"/>
-              <w:right w:w="0" w:type="dxa"/>
-            </w:tcMar>
-          </w:tcPr>
-          <w:p>
-            <w:pPr>
-              <w:keepNext/>
-              <w:spacing w:before="0" w:after="0"/>
-            </w:pPr>
-            <w:r>
-              <w:rPr>
-                <w:rFonts w:ascii="Calibri" w:hAnsi="Calibri" w:cs="Calibri" w:eastAsia="Calibri"/>
-                <w:b/>
-                <w:i w:val="0"/>
-                <w:color w:val="12241A"/>
-                <w:sz w:val="17"/>
-                <w:spacing w:val="28"/>
-                <w:caps w:val="1"/>
-              </w:rPr>
-              <w:t>Seguimiento</w:t>
-            </w:r>
-          </w:p>
-        </w:tc>
-        <w:tc>
-          <w:tcPr>
-            <w:tcW w:type="dxa" w:w="4422"/>
-            <w:vAlign w:val="center"/>
-            <w:tcMar>
-              <w:top w:w="0" w:type="dxa"/>
-              <w:bottom w:w="0" w:type="dxa"/>
-              <w:left w:w="0" w:type="dxa"/>
-              <w:right w:w="0" w:type="dxa"/>
-            </w:tcMar>
-            <w:tcMar>
-              <w:top w:w="0" w:type="dxa"/>
-              <w:bottom w:w="60" w:type="dxa"/>
-              <w:left w:w="120" w:type="dxa"/>
-              <w:right w:w="0" w:type="dxa"/>
-            </w:tcMar>
-          </w:tcPr>
-          <w:p>
-            <w:pPr>
-              <w:spacing w:before="0" w:after="0"/>
-              <w:keepNext/>
-              <w:pBdr>
-                <w:bottom w:val="single" w:sz="4" w:space="0" w:color="B7C2BA"/>
-              </w:pBdr>
-            </w:pPr>
-            <w:r>
-              <w:rPr>
-                <w:sz w:val="6"/>
-              </w:rPr>
-              <w:t xml:space="preserve"> </w:t>
-            </w:r>
-          </w:p>
-        </w:tc>
-      </w:tr>
-    </w:tbl>
-    <w:p>
-      <w:pPr>
-        <w:keepNext/>
         <w:spacing w:after="0"/>
       </w:pPr>
+      <w:r>
+        <w:rPr>
+          <w:rFonts w:ascii="Calibri" w:hAnsi="Calibri" w:cs="Calibri" w:eastAsia="Calibri"/>
+          <w:b w:val="0"/>
+          <w:i w:val="0"/>
+          <w:color w:val="FFFFFF"/>
+          <w:sz w:val="2"/>
+        </w:rPr>
+        <w:t>{/HAY_PASOS}</w:t>
+      </w:r>
     </w:p>
-    <w:tbl>
-      <w:tblPr>
-        <w:tblW w:type="dxa" w:w="10206"/>
-        <w:tblLayout w:type="fixed"/>
-        <w:tblLook w:firstColumn="1" w:firstRow="1" w:lastColumn="0" w:lastRow="0" w:noHBand="0" w:noVBand="1" w:val="04A0"/>
-        <w:tblLayout w:type="fixed"/>
-        <w:tblBorders>
-          <w:top w:val="single" w:sz="4" w:space="0" w:color="B7C2BA"/>
-          <w:left w:val="single" w:sz="4" w:space="0" w:color="B7C2BA"/>
-          <w:bottom w:val="single" w:sz="4" w:space="0" w:color="B7C2BA"/>
-          <w:right w:val="single" w:sz="4" w:space="0" w:color="B7C2BA"/>
-          <w:insideH w:val="nil"/>
-          <w:insideV w:val="single" w:sz="6" w:space="0" w:color="9DB8A6"/>
-        </w:tblBorders>
-      </w:tblPr>
-      <w:tblGrid>
-        <w:gridCol w:w="510"/>
-        <w:gridCol w:w="9695"/>
-      </w:tblGrid>
-      <w:tr>
-        <w:trPr>
-          <w:cantSplit/>
-        </w:trPr>
-        <w:tc>
-          <w:tcPr>
-            <w:tcW w:type="dxa" w:w="510"/>
-            <w:tcMar>
-              <w:top w:w="0" w:type="dxa"/>
-              <w:bottom w:w="0" w:type="dxa"/>
-              <w:left w:w="0" w:type="dxa"/>
-              <w:right w:w="0" w:type="dxa"/>
-            </w:tcMar>
-          </w:tcPr>
-          <w:p>
-            <w:pPr>
-              <w:spacing w:before="0" w:after="0"/>
-            </w:pPr>
-            <w:r>
-              <w:rPr>
-                <w:rFonts w:ascii="Calibri" w:hAnsi="Calibri" w:cs="Calibri" w:eastAsia="Calibri"/>
-                <w:b w:val="0"/>
-                <w:i w:val="0"/>
-                <w:color w:val="FFFFFF"/>
-                <w:sz w:val="2"/>
-              </w:rPr>
-              <w:t>{#NOTAS}</w:t>
-            </w:r>
-          </w:p>
-        </w:tc>
-        <w:tc>
-          <w:tcPr>
-            <w:tcW w:type="dxa" w:w="9694"/>
-            <w:tcMar>
-              <w:top w:w="110" w:type="dxa"/>
-              <w:bottom w:w="160" w:type="dxa"/>
-              <w:left w:w="200" w:type="dxa"/>
-              <w:right w:w="160" w:type="dxa"/>
-            </w:tcMar>
-          </w:tcPr>
-          <w:p>
-            <w:pPr>
-              <w:keepNext/>
-              <w:spacing w:before="0" w:after="0"/>
-              <w:ind w:left="-266"/>
-            </w:pPr>
-            <w:r>
-              <w:rPr>
-                <w:rFonts w:ascii="Calibri" w:hAnsi="Calibri" w:cs="Calibri" w:eastAsia="Calibri"/>
-                <w:b w:val="0"/>
-                <w:i w:val="0"/>
-                <w:color w:val="0F6B3F"/>
-                <w:sz w:val="22"/>
-              </w:rPr>
-              <w:t>●</w:t>
-            </w:r>
-            <w:r>
-              <w:rPr>
-                <w:rFonts w:ascii="Calibri" w:hAnsi="Calibri" w:cs="Calibri" w:eastAsia="Calibri"/>
-                <w:b w:val="0"/>
-                <w:i w:val="0"/>
-                <w:color w:val="12241A"/>
-                <w:sz w:val="16"/>
-              </w:rPr>
-              <w:t xml:space="preserve">   </w:t>
-            </w:r>
-            <w:r>
-              <w:rPr>
-                <w:rFonts w:ascii="Calibri" w:hAnsi="Calibri" w:cs="Calibri" w:eastAsia="Calibri"/>
-                <w:b/>
-                <w:i w:val="0"/>
-                <w:color w:val="12241A"/>
-                <w:sz w:val="17"/>
-                <w:spacing w:val="24"/>
-                <w:caps w:val="1"/>
-              </w:rPr>
-              <w:t>{TITULO}</w:t>
-            </w:r>
-          </w:p>
-          <w:p>
-            <w:pPr>
-              <w:keepNext/>
-              <w:spacing w:before="20" w:after="80"/>
-            </w:pPr>
-            <w:r>
-              <w:rPr>
-                <w:rFonts w:ascii="Calibri" w:hAnsi="Calibri" w:cs="Calibri" w:eastAsia="Calibri"/>
-                <w:b w:val="0"/>
-                <w:i w:val="0"/>
-                <w:color w:val="6D7A72"/>
-                <w:sz w:val="15"/>
-              </w:rPr>
-              <w:t>{META}</w:t>
-            </w:r>
-          </w:p>
-          <w:p>
-            <w:pPr>
-              <w:spacing w:before="0" w:after="0"/>
-            </w:pPr>
-            <w:r>
-              <w:rPr>
-                <w:rFonts w:ascii="Calibri" w:hAnsi="Calibri" w:cs="Calibri" w:eastAsia="Calibri"/>
-                <w:b w:val="0"/>
-                <w:i w:val="0"/>
-                <w:color w:val="FFFFFF"/>
-                <w:sz w:val="2"/>
-              </w:rPr>
-              <w:t>{#esPaso}</w:t>
-            </w:r>
-          </w:p>
-          <w:p>
-            <w:pPr>
-              <w:keepNext/>
-              <w:spacing w:before="40" w:after="0"/>
-            </w:pPr>
-            <w:r>
-              <w:rPr>
-                <w:rFonts w:ascii="Calibri" w:hAnsi="Calibri" w:cs="Calibri" w:eastAsia="Calibri"/>
-                <w:b w:val="0"/>
-                <w:i w:val="0"/>
-                <w:color w:val="6D7A72"/>
-                <w:sz w:val="13"/>
-                <w:spacing w:val="24"/>
-                <w:caps w:val="1"/>
-              </w:rPr>
-              <w:t>Motivo</w:t>
-            </w:r>
-          </w:p>
-          <w:p>
-            <w:pPr>
-              <w:spacing w:before="20" w:after="80" w:line="276" w:lineRule="auto"/>
-            </w:pPr>
-            <w:r>
-              <w:rPr>
-                <w:rFonts w:ascii="Georgia" w:hAnsi="Georgia" w:cs="Georgia" w:eastAsia="Georgia"/>
-                <w:b w:val="0"/>
-                <w:i w:val="0"/>
-                <w:color w:val="12241A"/>
-                <w:sz w:val="20"/>
-              </w:rPr>
-              <w:t>{MOTIVO}</w:t>
-            </w:r>
-          </w:p>
-          <w:p>
-            <w:pPr>
-              <w:keepNext/>
-              <w:spacing w:before="40" w:after="0"/>
-            </w:pPr>
-            <w:r>
-              <w:rPr>
-                <w:rFonts w:ascii="Calibri" w:hAnsi="Calibri" w:cs="Calibri" w:eastAsia="Calibri"/>
-                <w:b w:val="0"/>
-                <w:i w:val="0"/>
-                <w:color w:val="6D7A72"/>
-                <w:sz w:val="13"/>
-                <w:spacing w:val="24"/>
-                <w:caps w:val="1"/>
-              </w:rPr>
-              <w:t>Especificación de la conducta</w:t>
-            </w:r>
-          </w:p>
-          <w:p>
-            <w:pPr>
-              <w:spacing w:before="20" w:after="80" w:line="276" w:lineRule="auto"/>
-            </w:pPr>
-            <w:r>
-              <w:rPr>
-                <w:rFonts w:ascii="Georgia" w:hAnsi="Georgia" w:cs="Georgia" w:eastAsia="Georgia"/>
-                <w:b w:val="0"/>
-                <w:i w:val="0"/>
-                <w:color w:val="12241A"/>
-                <w:sz w:val="20"/>
-              </w:rPr>
-              <w:t>{ESPECIFICACION}</w:t>
-            </w:r>
-          </w:p>
-          <w:p>
-            <w:pPr>
-              <w:keepNext/>
-              <w:spacing w:before="40" w:after="0"/>
-            </w:pPr>
-            <w:r>
-              <w:rPr>
-                <w:rFonts w:ascii="Calibri" w:hAnsi="Calibri" w:cs="Calibri" w:eastAsia="Calibri"/>
-                <w:b w:val="0"/>
-                <w:i w:val="0"/>
-                <w:color w:val="6D7A72"/>
-                <w:sz w:val="13"/>
-                <w:spacing w:val="24"/>
-                <w:caps w:val="1"/>
-              </w:rPr>
-              <w:t>Medidas pedagógicas aplicadas</w:t>
-            </w:r>
-          </w:p>
-          <w:p>
-            <w:pPr>
-              <w:spacing w:before="20" w:after="80" w:line="276" w:lineRule="auto"/>
-            </w:pPr>
-            <w:r>
-              <w:rPr>
-                <w:rFonts w:ascii="Georgia" w:hAnsi="Georgia" w:cs="Georgia" w:eastAsia="Georgia"/>
-                <w:b w:val="0"/>
-                <w:i w:val="0"/>
-                <w:color w:val="12241A"/>
-                <w:sz w:val="20"/>
-              </w:rPr>
-              <w:t>{MEDIDAS}</w:t>
-            </w:r>
-          </w:p>
-          <w:p>
-            <w:pPr>
-              <w:spacing w:before="80" w:after="0"/>
-            </w:pPr>
-            <w:r>
-              <w:rPr>
-                <w:rFonts w:ascii="Calibri" w:hAnsi="Calibri" w:cs="Calibri" w:eastAsia="Calibri"/>
-                <w:b w:val="0"/>
-                <w:i w:val="0"/>
-                <w:color w:val="6D7A72"/>
-                <w:sz w:val="12"/>
-              </w:rPr>
-              <w:t>{FIRMA_TAG}</w:t>
-            </w:r>
-          </w:p>
-          <w:p>
-            <w:pPr>
-              <w:spacing w:before="20" w:after="0"/>
-            </w:pPr>
-            <w:r>
-              <w:rPr>
-                <w:rFonts w:ascii="Georgia" w:hAnsi="Georgia" w:cs="Georgia" w:eastAsia="Georgia"/>
-                <w:b w:val="0"/>
-                <w:i w:val="0"/>
-                <w:color w:val="12241A"/>
-                <w:sz w:val="19"/>
-              </w:rPr>
-              <w:t>{QUIEN}</w:t>
-            </w:r>
-          </w:p>
-          <w:p>
-            <w:pPr>
-              <w:spacing w:before="0" w:after="0"/>
-            </w:pPr>
-            <w:r>
-              <w:rPr>
-                <w:rFonts w:ascii="Calibri" w:hAnsi="Calibri" w:cs="Calibri" w:eastAsia="Calibri"/>
-                <w:b w:val="0"/>
-                <w:i w:val="0"/>
-                <w:color w:val="FFFFFF"/>
-                <w:sz w:val="2"/>
-              </w:rPr>
-              <w:t>{/esPaso}</w:t>
-            </w:r>
-          </w:p>
-          <w:p>
-            <w:pPr>
-              <w:spacing w:before="0" w:after="0"/>
-            </w:pPr>
-            <w:r>
-              <w:rPr>
-                <w:rFonts w:ascii="Calibri" w:hAnsi="Calibri" w:cs="Calibri" w:eastAsia="Calibri"/>
-                <w:b w:val="0"/>
-                <w:i w:val="0"/>
-                <w:color w:val="FFFFFF"/>
-                <w:sz w:val="2"/>
-              </w:rPr>
-              <w:t>{#esNota}</w:t>
-            </w:r>
-          </w:p>
-          <w:p>
-            <w:pPr>
-              <w:spacing w:before="20" w:after="0" w:line="276" w:lineRule="auto"/>
-            </w:pPr>
-            <w:r>
-              <w:rPr>
-                <w:rFonts w:ascii="Georgia" w:hAnsi="Georgia" w:cs="Georgia" w:eastAsia="Georgia"/>
-                <w:b w:val="0"/>
-                <w:i w:val="0"/>
-                <w:color w:val="12241A"/>
-                <w:sz w:val="20"/>
-              </w:rPr>
-              <w:t>{TEXTO}</w:t>
-            </w:r>
-          </w:p>
-          <w:p>
-            <w:pPr>
-              <w:spacing w:before="0" w:after="0"/>
-            </w:pPr>
-            <w:r>
-              <w:rPr>
-                <w:rFonts w:ascii="Calibri" w:hAnsi="Calibri" w:cs="Calibri" w:eastAsia="Calibri"/>
-                <w:b w:val="0"/>
-                <w:i w:val="0"/>
-                <w:color w:val="FFFFFF"/>
-                <w:sz w:val="2"/>
-              </w:rPr>
-              <w:t>{/esNota}</w:t>
-            </w:r>
-          </w:p>
-          <w:p>
-            <w:pPr>
-              <w:spacing w:before="0" w:after="0"/>
-            </w:pPr>
-            <w:r>
-              <w:rPr>
-                <w:rFonts w:ascii="Calibri" w:hAnsi="Calibri" w:cs="Calibri" w:eastAsia="Calibri"/>
-                <w:b w:val="0"/>
-                <w:i w:val="0"/>
-                <w:color w:val="FFFFFF"/>
-                <w:sz w:val="2"/>
-              </w:rPr>
-              <w:t>{/NOTAS}</w:t>
-            </w:r>
-          </w:p>
-        </w:tc>
-      </w:tr>
-    </w:tbl>
+    <w:p>
+      <w:r>
+        <w:rPr>
+          <w:rFonts w:ascii="Georgia" w:hAnsi="Georgia" w:cs="Georgia" w:eastAsia="Georgia"/>
+          <w:b w:val="0"/>
+          <w:i w:val="0"/>
+          <w:color w:val="6D7A72"/>
+          <w:sz w:val="19"/>
+        </w:rPr>
+        <w:t>{^HAY_PASOS}Esta remisión no ha sido remitida a otra persona.{/HAY_PASOS}</w:t>
+      </w:r>
+    </w:p>
     <w:sectPr>
-      <w:footerReference w:type="default" r:id="rId16"/>
+      <w:footerReference w:type="default" r:id="rId15"/>
       <w:pgSz w:w="12240" w:h="15840"/>
       <w:pgMar w:top="907" w:right="1020" w:bottom="907" w:left="1020" w:header="720" w:footer="510" w:gutter="0"/>
       <w:cols w:space="720"/>

</xml_diff>

<commit_message>
fix(orientacion): Word de remisión: seguimientos de la más antigua a la más nueva y título Seguimiento más grande
</commit_message>
<xml_diff>
--- a/public/remision_template.docx
+++ b/public/remision_template.docx
@@ -2108,10 +2108,10 @@
             <w:r>
               <w:rPr>
                 <w:rFonts w:ascii="Calibri" w:hAnsi="Calibri" w:cs="Calibri" w:eastAsia="Calibri"/>
-                <w:b w:val="0"/>
+                <w:b/>
                 <w:i w:val="0"/>
-                <w:color w:val="6D7A72"/>
-                <w:sz w:val="13"/>
+                <w:color w:val="12241A"/>
+                <w:sz w:val="17"/>
                 <w:spacing w:val="24"/>
                 <w:caps w:val="1"/>
               </w:rPr>
@@ -2900,10 +2900,10 @@
             <w:r>
               <w:rPr>
                 <w:rFonts w:ascii="Calibri" w:hAnsi="Calibri" w:cs="Calibri" w:eastAsia="Calibri"/>
-                <w:b w:val="0"/>
+                <w:b/>
                 <w:i w:val="0"/>
-                <w:color w:val="6D7A72"/>
-                <w:sz w:val="13"/>
+                <w:color w:val="12241A"/>
+                <w:sz w:val="17"/>
                 <w:spacing w:val="24"/>
                 <w:caps w:val="1"/>
               </w:rPr>

</xml_diff>

<commit_message>
fix(orientacion): Word de remisión: el recorrido aprovecha la página (las entradas se dividen si son largas) y los títulos Motivo, Especificación y Medidas van en negrilla roja, en la remisión y en cada paso
</commit_message>
<xml_diff>
--- a/public/remision_template.docx
+++ b/public/remision_template.docx
@@ -1332,7 +1332,7 @@
                 <w:rFonts w:ascii="Calibri" w:hAnsi="Calibri" w:cs="Calibri" w:eastAsia="Calibri"/>
                 <w:b/>
                 <w:i w:val="0"/>
-                <w:color w:val="12241A"/>
+                <w:color w:val="DC2626"/>
                 <w:sz w:val="17"/>
                 <w:spacing w:val="28"/>
                 <w:caps w:val="1"/>
@@ -1567,7 +1567,7 @@
                 <w:rFonts w:ascii="Calibri" w:hAnsi="Calibri" w:cs="Calibri" w:eastAsia="Calibri"/>
                 <w:b/>
                 <w:i w:val="0"/>
-                <w:color w:val="12241A"/>
+                <w:color w:val="DC2626"/>
                 <w:sz w:val="17"/>
                 <w:spacing w:val="28"/>
                 <w:caps w:val="1"/>
@@ -1801,7 +1801,7 @@
                 <w:rFonts w:ascii="Calibri" w:hAnsi="Calibri" w:cs="Calibri" w:eastAsia="Calibri"/>
                 <w:b/>
                 <w:i w:val="0"/>
-                <w:color w:val="12241A"/>
+                <w:color w:val="DC2626"/>
                 <w:sz w:val="17"/>
                 <w:spacing w:val="28"/>
                 <w:caps w:val="1"/>
@@ -2654,9 +2654,6 @@
         <w:gridCol w:w="9695"/>
       </w:tblGrid>
       <w:tr>
-        <w:trPr>
-          <w:cantSplit/>
-        </w:trPr>
         <w:tc>
           <w:tcPr>
             <w:tcW w:type="dxa" w:w="510"/>
@@ -2756,11 +2753,11 @@
             <w:r>
               <w:rPr>
                 <w:rFonts w:ascii="Calibri" w:hAnsi="Calibri" w:cs="Calibri" w:eastAsia="Calibri"/>
-                <w:b w:val="0"/>
+                <w:b/>
                 <w:i w:val="0"/>
-                <w:color w:val="6D7A72"/>
-                <w:sz w:val="13"/>
-                <w:spacing w:val="24"/>
+                <w:color w:val="DC2626"/>
+                <w:sz w:val="15"/>
+                <w:spacing w:val="22"/>
                 <w:caps w:val="1"/>
               </w:rPr>
               <w:t>Motivo</w:t>
@@ -2789,11 +2786,11 @@
             <w:r>
               <w:rPr>
                 <w:rFonts w:ascii="Calibri" w:hAnsi="Calibri" w:cs="Calibri" w:eastAsia="Calibri"/>
-                <w:b w:val="0"/>
+                <w:b/>
                 <w:i w:val="0"/>
-                <w:color w:val="6D7A72"/>
-                <w:sz w:val="13"/>
-                <w:spacing w:val="24"/>
+                <w:color w:val="DC2626"/>
+                <w:sz w:val="15"/>
+                <w:spacing w:val="22"/>
                 <w:caps w:val="1"/>
               </w:rPr>
               <w:t>Especificación de la conducta</w:t>
@@ -2822,11 +2819,11 @@
             <w:r>
               <w:rPr>
                 <w:rFonts w:ascii="Calibri" w:hAnsi="Calibri" w:cs="Calibri" w:eastAsia="Calibri"/>
-                <w:b w:val="0"/>
+                <w:b/>
                 <w:i w:val="0"/>
-                <w:color w:val="6D7A72"/>
-                <w:sz w:val="13"/>
-                <w:spacing w:val="24"/>
+                <w:color w:val="DC2626"/>
+                <w:sz w:val="15"/>
+                <w:spacing w:val="22"/>
                 <w:caps w:val="1"/>
               </w:rPr>
               <w:t>Medidas pedagógicas aplicadas</w:t>

</xml_diff>

<commit_message>
feat(orientacion): Word de remisión muestra la situación actual (último paso) igual que la plataforma, con Remitido por / Dirigida a; la remisión original y los pasos anteriores quedan en el Recorrido; en la plataforma el nombre de quien remite va bajo la firma y 'Atendida por' sube al encabezado
</commit_message>
<xml_diff>
--- a/public/remision_template.docx
+++ b/public/remision_template.docx
@@ -868,6 +868,108 @@
           </w:p>
         </w:tc>
       </w:tr>
+      <w:tr>
+        <w:tc>
+          <w:tcPr>
+            <w:tcW w:type="dxa" w:w="4762"/>
+            <w:gridSpan w:val="2"/>
+            <w:tcMar>
+              <w:top w:w="70" w:type="dxa"/>
+              <w:bottom w:w="90" w:type="dxa"/>
+              <w:left w:w="120" w:type="dxa"/>
+              <w:right w:w="100" w:type="dxa"/>
+            </w:tcMar>
+            <w:tcBorders>
+              <w:top w:val="single" w:sz="4" w:space="0" w:color="B7C2BA"/>
+              <w:left w:val="single" w:sz="4" w:space="0" w:color="B7C2BA"/>
+              <w:bottom w:val="single" w:sz="4" w:space="0" w:color="B7C2BA"/>
+              <w:right w:val="single" w:sz="4" w:space="0" w:color="B7C2BA"/>
+            </w:tcBorders>
+          </w:tcPr>
+          <w:p>
+            <w:pPr>
+              <w:spacing w:before="0" w:after="0"/>
+            </w:pPr>
+            <w:r>
+              <w:rPr>
+                <w:rFonts w:ascii="Calibri" w:hAnsi="Calibri" w:cs="Calibri" w:eastAsia="Calibri"/>
+                <w:b w:val="0"/>
+                <w:i w:val="0"/>
+                <w:color w:val="6D7A72"/>
+                <w:sz w:val="13"/>
+                <w:spacing w:val="24"/>
+                <w:caps w:val="1"/>
+              </w:rPr>
+              <w:t>Remitido por</w:t>
+            </w:r>
+          </w:p>
+          <w:p>
+            <w:pPr>
+              <w:spacing w:before="20" w:after="0"/>
+            </w:pPr>
+            <w:r>
+              <w:rPr>
+                <w:rFonts w:ascii="Georgia" w:hAnsi="Georgia" w:cs="Georgia" w:eastAsia="Georgia"/>
+                <w:b w:val="0"/>
+                <w:i w:val="0"/>
+                <w:color w:val="12241A"/>
+                <w:sz w:val="21"/>
+              </w:rPr>
+              <w:t>{REMITIDO_POR}</w:t>
+            </w:r>
+          </w:p>
+        </w:tc>
+        <w:tc>
+          <w:tcPr>
+            <w:tcW w:type="dxa" w:w="5442"/>
+            <w:gridSpan w:val="4"/>
+            <w:tcMar>
+              <w:top w:w="70" w:type="dxa"/>
+              <w:bottom w:w="90" w:type="dxa"/>
+              <w:left w:w="120" w:type="dxa"/>
+              <w:right w:w="100" w:type="dxa"/>
+            </w:tcMar>
+            <w:tcBorders>
+              <w:top w:val="single" w:sz="4" w:space="0" w:color="B7C2BA"/>
+              <w:left w:val="single" w:sz="4" w:space="0" w:color="B7C2BA"/>
+              <w:bottom w:val="single" w:sz="4" w:space="0" w:color="B7C2BA"/>
+              <w:right w:val="single" w:sz="4" w:space="0" w:color="B7C2BA"/>
+            </w:tcBorders>
+          </w:tcPr>
+          <w:p>
+            <w:pPr>
+              <w:spacing w:before="0" w:after="0"/>
+            </w:pPr>
+            <w:r>
+              <w:rPr>
+                <w:rFonts w:ascii="Calibri" w:hAnsi="Calibri" w:cs="Calibri" w:eastAsia="Calibri"/>
+                <w:b w:val="0"/>
+                <w:i w:val="0"/>
+                <w:color w:val="6D7A72"/>
+                <w:sz w:val="13"/>
+                <w:spacing w:val="24"/>
+                <w:caps w:val="1"/>
+              </w:rPr>
+              <w:t>Dirigida a</w:t>
+            </w:r>
+          </w:p>
+          <w:p>
+            <w:pPr>
+              <w:spacing w:before="20" w:after="0"/>
+            </w:pPr>
+            <w:r>
+              <w:rPr>
+                <w:rFonts w:ascii="Georgia" w:hAnsi="Georgia" w:cs="Georgia" w:eastAsia="Georgia"/>
+                <w:b w:val="0"/>
+                <w:i w:val="0"/>
+                <w:color w:val="12241A"/>
+                <w:sz w:val="21"/>
+              </w:rPr>
+              <w:t>{DIRIGIDA_A}</w:t>
+            </w:r>
+          </w:p>
+        </w:tc>
+      </w:tr>
     </w:tbl>
     <w:p>
       <w:pPr>

</xml_diff>

<commit_message>
feat(orientacion): Word de remisión: fila Recorrido (Dirección de grupo → Coordinación → …) en Datos de identificación, como en la plataforma
</commit_message>
<xml_diff>
--- a/public/remision_template.docx
+++ b/public/remision_template.docx
@@ -970,6 +970,58 @@
           </w:p>
         </w:tc>
       </w:tr>
+      <w:tr>
+        <w:tc>
+          <w:tcPr>
+            <w:tcW w:type="dxa" w:w="10204"/>
+            <w:gridSpan w:val="6"/>
+            <w:tcMar>
+              <w:top w:w="70" w:type="dxa"/>
+              <w:bottom w:w="90" w:type="dxa"/>
+              <w:left w:w="120" w:type="dxa"/>
+              <w:right w:w="100" w:type="dxa"/>
+            </w:tcMar>
+            <w:tcBorders>
+              <w:top w:val="single" w:sz="4" w:space="0" w:color="B7C2BA"/>
+              <w:left w:val="single" w:sz="4" w:space="0" w:color="B7C2BA"/>
+              <w:bottom w:val="single" w:sz="4" w:space="0" w:color="B7C2BA"/>
+              <w:right w:val="single" w:sz="4" w:space="0" w:color="B7C2BA"/>
+            </w:tcBorders>
+          </w:tcPr>
+          <w:p>
+            <w:pPr>
+              <w:spacing w:before="0" w:after="0"/>
+            </w:pPr>
+            <w:r>
+              <w:rPr>
+                <w:rFonts w:ascii="Calibri" w:hAnsi="Calibri" w:cs="Calibri" w:eastAsia="Calibri"/>
+                <w:b w:val="0"/>
+                <w:i w:val="0"/>
+                <w:color w:val="6D7A72"/>
+                <w:sz w:val="13"/>
+                <w:spacing w:val="24"/>
+                <w:caps w:val="1"/>
+              </w:rPr>
+              <w:t>Recorrido</w:t>
+            </w:r>
+          </w:p>
+          <w:p>
+            <w:pPr>
+              <w:spacing w:before="20" w:after="0"/>
+            </w:pPr>
+            <w:r>
+              <w:rPr>
+                <w:rFonts w:ascii="Georgia" w:hAnsi="Georgia" w:cs="Georgia" w:eastAsia="Georgia"/>
+                <w:b w:val="0"/>
+                <w:i w:val="0"/>
+                <w:color w:val="12241A"/>
+                <w:sz w:val="21"/>
+              </w:rPr>
+              <w:t>{RECORRIDO_LINEA}</w:t>
+            </w:r>
+          </w:p>
+        </w:tc>
+      </w:tr>
     </w:tbl>
     <w:p>
       <w:pPr>

</xml_diff>

<commit_message>
feat(orientacion): Word de remisión paginado: 'Página X de Y' en el borde superior derecho
</commit_message>
<xml_diff>
--- a/public/remision_template.docx
+++ b/public/remision_template.docx
@@ -257,7 +257,7 @@
                           <pic:cNvPicPr/>
                         </pic:nvPicPr>
                         <pic:blipFill>
-                          <a:blip r:embed="rId9"/>
+                          <a:blip r:embed="rId10"/>
                           <a:stretch>
                             <a:fillRect/>
                           </a:stretch>
@@ -1082,7 +1082,7 @@
                           <pic:cNvPicPr/>
                         </pic:nvPicPr>
                         <pic:blipFill>
-                          <a:blip r:embed="rId10"/>
+                          <a:blip r:embed="rId11"/>
                           <a:stretch>
                             <a:fillRect/>
                           </a:stretch>
@@ -1439,7 +1439,7 @@
                           <pic:cNvPicPr/>
                         </pic:nvPicPr>
                         <pic:blipFill>
-                          <a:blip r:embed="rId11"/>
+                          <a:blip r:embed="rId12"/>
                           <a:stretch>
                             <a:fillRect/>
                           </a:stretch>
@@ -1674,7 +1674,7 @@
                           <pic:cNvPicPr/>
                         </pic:nvPicPr>
                         <pic:blipFill>
-                          <a:blip r:embed="rId12"/>
+                          <a:blip r:embed="rId13"/>
                           <a:stretch>
                             <a:fillRect/>
                           </a:stretch>
@@ -1908,7 +1908,7 @@
                           <pic:cNvPicPr/>
                         </pic:nvPicPr>
                         <pic:blipFill>
-                          <a:blip r:embed="rId13"/>
+                          <a:blip r:embed="rId14"/>
                           <a:stretch>
                             <a:fillRect/>
                           </a:stretch>
@@ -2449,7 +2449,7 @@
                           <pic:cNvPicPr/>
                         </pic:nvPicPr>
                         <pic:blipFill>
-                          <a:blip r:embed="rId14"/>
+                          <a:blip r:embed="rId15"/>
                           <a:stretch>
                             <a:fillRect/>
                           </a:stretch>
@@ -3207,9 +3207,10 @@
       </w:r>
     </w:p>
     <w:sectPr>
-      <w:footerReference w:type="default" r:id="rId15"/>
+      <w:headerReference w:type="default" r:id="rId9"/>
+      <w:footerReference w:type="default" r:id="rId16"/>
       <w:pgSz w:w="12240" w:h="15840"/>
-      <w:pgMar w:top="907" w:right="1020" w:bottom="907" w:left="1020" w:header="720" w:footer="510" w:gutter="0"/>
+      <w:pgMar w:top="907" w:right="1020" w:bottom="907" w:left="1020" w:header="397" w:footer="510" w:gutter="0"/>
       <w:cols w:space="720"/>
       <w:docGrid w:linePitch="360"/>
     </w:sectPr>
@@ -3311,6 +3312,102 @@
     </w:tr>
   </w:tbl>
 </w:ftr>
+</file>
+
+<file path=word/header1.xml><?xml version="1.0" encoding="utf-8"?>
+<w:hdr xmlns:m="http://schemas.openxmlformats.org/officeDocument/2006/math" xmlns:mc="http://schemas.openxmlformats.org/markup-compatibility/2006" xmlns:mo="http://schemas.microsoft.com/office/mac/office/2008/main" xmlns:mv="urn:schemas-microsoft-com:mac:vml" xmlns:o="urn:schemas-microsoft-com:office:office" xmlns:r="http://schemas.openxmlformats.org/officeDocument/2006/relationships" xmlns:v="urn:schemas-microsoft-com:vml" xmlns:w10="urn:schemas-microsoft-com:office:word" xmlns:w14="http://schemas.microsoft.com/office/word/2010/wordml" xmlns:w="http://schemas.openxmlformats.org/wordprocessingml/2006/main" xmlns:wne="http://schemas.microsoft.com/office/word/2006/wordml" xmlns:wp14="http://schemas.microsoft.com/office/word/2010/wordprocessingDrawing" xmlns:wp="http://schemas.openxmlformats.org/drawingml/2006/wordprocessingDrawing" xmlns:wpc="http://schemas.microsoft.com/office/word/2010/wordprocessingCanvas" xmlns:wpg="http://schemas.microsoft.com/office/word/2010/wordprocessingGroup" xmlns:wpi="http://schemas.microsoft.com/office/word/2010/wordprocessingInk" xmlns:wps="http://schemas.microsoft.com/office/word/2010/wordprocessingShape" mc:Ignorable="w14 wp14">
+  <w:p>
+    <w:pPr>
+      <w:pStyle w:val="Header"/>
+      <w:spacing w:after="0"/>
+      <w:jc w:val="right"/>
+    </w:pPr>
+    <w:r>
+      <w:rPr>
+        <w:rFonts w:ascii="Calibri" w:hAnsi="Calibri" w:cs="Calibri" w:eastAsia="Calibri"/>
+        <w:b w:val="0"/>
+        <w:i w:val="0"/>
+        <w:color w:val="8A958E"/>
+        <w:sz w:val="14"/>
+        <w:spacing w:val="14"/>
+        <w:caps w:val="1"/>
+      </w:rPr>
+      <w:t xml:space="preserve">Página </w:t>
+    </w:r>
+    <w:r>
+      <w:rPr>
+        <w:rFonts w:ascii="Calibri" w:hAnsi="Calibri"/>
+        <w:color w:val="8A958E"/>
+        <w:sz w:val="14"/>
+      </w:rPr>
+      <w:fldChar w:fldCharType="begin"/>
+    </w:r>
+    <w:r>
+      <w:rPr>
+        <w:rFonts w:ascii="Calibri" w:hAnsi="Calibri"/>
+        <w:color w:val="8A958E"/>
+        <w:sz w:val="14"/>
+      </w:rPr>
+      <w:instrText xml:space="preserve"> PAGE </w:instrText>
+    </w:r>
+    <w:r>
+      <w:fldChar w:fldCharType="separate"/>
+    </w:r>
+    <w:r>
+      <w:rPr>
+        <w:rFonts w:ascii="Calibri" w:hAnsi="Calibri"/>
+        <w:color w:val="8A958E"/>
+        <w:sz w:val="14"/>
+      </w:rPr>
+      <w:t>1</w:t>
+    </w:r>
+    <w:r>
+      <w:fldChar w:fldCharType="end"/>
+    </w:r>
+    <w:r>
+      <w:rPr>
+        <w:rFonts w:ascii="Calibri" w:hAnsi="Calibri" w:cs="Calibri" w:eastAsia="Calibri"/>
+        <w:b w:val="0"/>
+        <w:i w:val="0"/>
+        <w:color w:val="8A958E"/>
+        <w:sz w:val="14"/>
+        <w:spacing w:val="14"/>
+        <w:caps w:val="1"/>
+      </w:rPr>
+      <w:t xml:space="preserve"> de </w:t>
+    </w:r>
+    <w:r>
+      <w:rPr>
+        <w:rFonts w:ascii="Calibri" w:hAnsi="Calibri"/>
+        <w:color w:val="8A958E"/>
+        <w:sz w:val="14"/>
+      </w:rPr>
+      <w:fldChar w:fldCharType="begin"/>
+    </w:r>
+    <w:r>
+      <w:rPr>
+        <w:rFonts w:ascii="Calibri" w:hAnsi="Calibri"/>
+        <w:color w:val="8A958E"/>
+        <w:sz w:val="14"/>
+      </w:rPr>
+      <w:instrText xml:space="preserve"> NUMPAGES </w:instrText>
+    </w:r>
+    <w:r>
+      <w:fldChar w:fldCharType="separate"/>
+    </w:r>
+    <w:r>
+      <w:rPr>
+        <w:rFonts w:ascii="Calibri" w:hAnsi="Calibri"/>
+        <w:color w:val="8A958E"/>
+        <w:sz w:val="14"/>
+      </w:rPr>
+      <w:t>1</w:t>
+    </w:r>
+    <w:r>
+      <w:fldChar w:fldCharType="end"/>
+    </w:r>
+  </w:p>
+</w:hdr>
 </file>
 
 <file path=word/numbering.xml><?xml version="1.0" encoding="utf-8"?>

</xml_diff>